<commit_message>
Final submission sync: pitch, investor brief, and Support Hub brand casing.
Lock in the delivered deck and brief, and show ElimuMatch (not ELIMUMATCH) on the Support Hub header.

Co-authored-by: Cursor <cursoragent@cursor.com>
</commit_message>
<xml_diff>
--- a/ElimuMatch_Investor_Brief.docx
+++ b/ElimuMatch_Investor_Brief.docx
@@ -391,6 +391,7 @@
           <w:pPr>
             <w:pStyle w:val="TOC1"/>
             <w:rPr>
+              <w:rFonts w:asciiTheme="minorHAnsi" w:eastAsiaTheme="minorEastAsia" w:hAnsiTheme="minorHAnsi"/>
               <w:kern w:val="2"/>
               <w:lang w:val="en-KE" w:eastAsia="en-KE"/>
               <w14:ligatures w14:val="standardContextual"/>
@@ -405,7 +406,7 @@
           <w:r>
             <w:fldChar w:fldCharType="separate"/>
           </w:r>
-          <w:hyperlink w:anchor="_Toc239679990" w:history="1">
+          <w:hyperlink w:anchor="_Toc239855403" w:history="1">
             <w:r>
               <w:rPr>
                 <w:rStyle w:val="Hyperlink"/>
@@ -428,7 +429,7 @@
               <w:rPr>
                 <w:webHidden/>
               </w:rPr>
-              <w:instrText xml:space="preserve"> PAGEREF _Toc239679990 \h </w:instrText>
+              <w:instrText xml:space="preserve"> PAGEREF _Toc239855403 \h </w:instrText>
             </w:r>
             <w:r>
               <w:rPr>
@@ -445,7 +446,7 @@
               <w:rPr>
                 <w:webHidden/>
               </w:rPr>
-              <w:t>4</w:t>
+              <w:t>3</w:t>
             </w:r>
             <w:r>
               <w:rPr>
@@ -459,12 +460,13 @@
           <w:pPr>
             <w:pStyle w:val="TOC1"/>
             <w:rPr>
+              <w:rFonts w:asciiTheme="minorHAnsi" w:eastAsiaTheme="minorEastAsia" w:hAnsiTheme="minorHAnsi"/>
               <w:kern w:val="2"/>
               <w:lang w:val="en-KE" w:eastAsia="en-KE"/>
               <w14:ligatures w14:val="standardContextual"/>
             </w:rPr>
           </w:pPr>
-          <w:hyperlink w:anchor="_Toc239679991" w:history="1">
+          <w:hyperlink w:anchor="_Toc239855404" w:history="1">
             <w:r>
               <w:rPr>
                 <w:rStyle w:val="Hyperlink"/>
@@ -487,7 +489,7 @@
               <w:rPr>
                 <w:webHidden/>
               </w:rPr>
-              <w:instrText xml:space="preserve"> PAGEREF _Toc239679991 \h </w:instrText>
+              <w:instrText xml:space="preserve"> PAGEREF _Toc239855404 \h </w:instrText>
             </w:r>
             <w:r>
               <w:rPr>
@@ -518,12 +520,13 @@
           <w:pPr>
             <w:pStyle w:val="TOC1"/>
             <w:rPr>
+              <w:rFonts w:asciiTheme="minorHAnsi" w:eastAsiaTheme="minorEastAsia" w:hAnsiTheme="minorHAnsi"/>
               <w:kern w:val="2"/>
               <w:lang w:val="en-KE" w:eastAsia="en-KE"/>
               <w14:ligatures w14:val="standardContextual"/>
             </w:rPr>
           </w:pPr>
-          <w:hyperlink w:anchor="_Toc239679992" w:history="1">
+          <w:hyperlink w:anchor="_Toc239855405" w:history="1">
             <w:r>
               <w:rPr>
                 <w:rStyle w:val="Hyperlink"/>
@@ -546,7 +549,7 @@
               <w:rPr>
                 <w:webHidden/>
               </w:rPr>
-              <w:instrText xml:space="preserve"> PAGEREF _Toc239679992 \h </w:instrText>
+              <w:instrText xml:space="preserve"> PAGEREF _Toc239855405 \h </w:instrText>
             </w:r>
             <w:r>
               <w:rPr>
@@ -577,12 +580,13 @@
           <w:pPr>
             <w:pStyle w:val="TOC1"/>
             <w:rPr>
+              <w:rFonts w:asciiTheme="minorHAnsi" w:eastAsiaTheme="minorEastAsia" w:hAnsiTheme="minorHAnsi"/>
               <w:kern w:val="2"/>
               <w:lang w:val="en-KE" w:eastAsia="en-KE"/>
               <w14:ligatures w14:val="standardContextual"/>
             </w:rPr>
           </w:pPr>
-          <w:hyperlink w:anchor="_Toc239679993" w:history="1">
+          <w:hyperlink w:anchor="_Toc239855406" w:history="1">
             <w:r>
               <w:rPr>
                 <w:rStyle w:val="Hyperlink"/>
@@ -605,7 +609,7 @@
               <w:rPr>
                 <w:webHidden/>
               </w:rPr>
-              <w:instrText xml:space="preserve"> PAGEREF _Toc239679993 \h </w:instrText>
+              <w:instrText xml:space="preserve"> PAGEREF _Toc239855406 \h </w:instrText>
             </w:r>
             <w:r>
               <w:rPr>
@@ -645,7 +649,7 @@
               <w14:ligatures w14:val="standardContextual"/>
             </w:rPr>
           </w:pPr>
-          <w:hyperlink w:anchor="_Toc239679994" w:history="1">
+          <w:hyperlink w:anchor="_Toc239855407" w:history="1">
             <w:r>
               <w:rPr>
                 <w:rStyle w:val="Hyperlink"/>
@@ -673,7 +677,7 @@
                 <w:noProof/>
                 <w:webHidden/>
               </w:rPr>
-              <w:instrText xml:space="preserve"> PAGEREF _Toc239679994 \h </w:instrText>
+              <w:instrText xml:space="preserve"> PAGEREF _Toc239855407 \h </w:instrText>
             </w:r>
             <w:r>
               <w:rPr>
@@ -717,7 +721,7 @@
               <w14:ligatures w14:val="standardContextual"/>
             </w:rPr>
           </w:pPr>
-          <w:hyperlink w:anchor="_Toc239679995" w:history="1">
+          <w:hyperlink w:anchor="_Toc239855408" w:history="1">
             <w:r>
               <w:rPr>
                 <w:rStyle w:val="Hyperlink"/>
@@ -745,80 +749,7 @@
                 <w:noProof/>
                 <w:webHidden/>
               </w:rPr>
-              <w:instrText xml:space="preserve"> PAGEREF _Toc239679995 \h </w:instrText>
-            </w:r>
-            <w:r>
-              <w:rPr>
-                <w:noProof/>
-                <w:webHidden/>
-              </w:rPr>
-            </w:r>
-            <w:r>
-              <w:rPr>
-                <w:noProof/>
-                <w:webHidden/>
-              </w:rPr>
-              <w:fldChar w:fldCharType="separate"/>
-            </w:r>
-            <w:r>
-              <w:rPr>
-                <w:noProof/>
-                <w:webHidden/>
-              </w:rPr>
-              <w:t>8</w:t>
-            </w:r>
-            <w:r>
-              <w:rPr>
-                <w:noProof/>
-                <w:webHidden/>
-              </w:rPr>
-              <w:fldChar w:fldCharType="end"/>
-            </w:r>
-          </w:hyperlink>
-        </w:p>
-        <w:p>
-          <w:pPr>
-            <w:pStyle w:val="TOC2"/>
-            <w:tabs>
-              <w:tab w:val="right" w:leader="dot" w:pos="9350"/>
-            </w:tabs>
-            <w:spacing w:after="0" w:line="240" w:lineRule="auto"/>
-            <w:rPr>
-              <w:noProof/>
-              <w:kern w:val="2"/>
-              <w:lang w:val="en-KE" w:eastAsia="en-KE"/>
-              <w14:ligatures w14:val="standardContextual"/>
-            </w:rPr>
-          </w:pPr>
-          <w:hyperlink w:anchor="_Toc239679996" w:history="1">
-            <w:r>
-              <w:rPr>
-                <w:rStyle w:val="Hyperlink"/>
-                <w:rFonts w:ascii="Bierstadt Display" w:eastAsia="Calibri" w:hAnsi="Bierstadt Display"/>
-                <w:noProof/>
-              </w:rPr>
-              <w:t>4.3 Skills concerns</w:t>
-            </w:r>
-            <w:r>
-              <w:rPr>
-                <w:noProof/>
-                <w:webHidden/>
-              </w:rPr>
-              <w:tab/>
-            </w:r>
-            <w:r>
-              <w:rPr>
-                <w:noProof/>
-                <w:webHidden/>
-              </w:rPr>
-              <w:fldChar w:fldCharType="begin"/>
-            </w:r>
-            <w:r>
-              <w:rPr>
-                <w:noProof/>
-                <w:webHidden/>
-              </w:rPr>
-              <w:instrText xml:space="preserve"> PAGEREF _Toc239679996 \h </w:instrText>
+              <w:instrText xml:space="preserve"> PAGEREF _Toc239855408 \h </w:instrText>
             </w:r>
             <w:r>
               <w:rPr>
@@ -862,14 +793,14 @@
               <w14:ligatures w14:val="standardContextual"/>
             </w:rPr>
           </w:pPr>
-          <w:hyperlink w:anchor="_Toc239679997" w:history="1">
+          <w:hyperlink w:anchor="_Toc239855409" w:history="1">
             <w:r>
               <w:rPr>
                 <w:rStyle w:val="Hyperlink"/>
                 <w:rFonts w:ascii="Bierstadt Display" w:eastAsia="Calibri" w:hAnsi="Bierstadt Display"/>
                 <w:noProof/>
               </w:rPr>
-              <w:t>4.4 The product problem</w:t>
+              <w:t>4.3 Skills concerns</w:t>
             </w:r>
             <w:r>
               <w:rPr>
@@ -890,7 +821,7 @@
                 <w:noProof/>
                 <w:webHidden/>
               </w:rPr>
-              <w:instrText xml:space="preserve"> PAGEREF _Toc239679997 \h </w:instrText>
+              <w:instrText xml:space="preserve"> PAGEREF _Toc239855409 \h </w:instrText>
             </w:r>
             <w:r>
               <w:rPr>
@@ -910,70 +841,11 @@
                 <w:noProof/>
                 <w:webHidden/>
               </w:rPr>
-              <w:t>9</w:t>
+              <w:t>8</w:t>
             </w:r>
             <w:r>
               <w:rPr>
                 <w:noProof/>
-                <w:webHidden/>
-              </w:rPr>
-              <w:fldChar w:fldCharType="end"/>
-            </w:r>
-          </w:hyperlink>
-        </w:p>
-        <w:p>
-          <w:pPr>
-            <w:pStyle w:val="TOC1"/>
-            <w:rPr>
-              <w:kern w:val="2"/>
-              <w:lang w:val="en-KE" w:eastAsia="en-KE"/>
-              <w14:ligatures w14:val="standardContextual"/>
-            </w:rPr>
-          </w:pPr>
-          <w:hyperlink w:anchor="_Toc239679998" w:history="1">
-            <w:r>
-              <w:rPr>
-                <w:rStyle w:val="Hyperlink"/>
-              </w:rPr>
-              <w:t>5. Strategic Analysis</w:t>
-            </w:r>
-            <w:r>
-              <w:rPr>
-                <w:webHidden/>
-              </w:rPr>
-              <w:tab/>
-            </w:r>
-            <w:r>
-              <w:rPr>
-                <w:webHidden/>
-              </w:rPr>
-              <w:fldChar w:fldCharType="begin"/>
-            </w:r>
-            <w:r>
-              <w:rPr>
-                <w:webHidden/>
-              </w:rPr>
-              <w:instrText xml:space="preserve"> PAGEREF _Toc239679998 \h </w:instrText>
-            </w:r>
-            <w:r>
-              <w:rPr>
-                <w:webHidden/>
-              </w:rPr>
-            </w:r>
-            <w:r>
-              <w:rPr>
-                <w:webHidden/>
-              </w:rPr>
-              <w:fldChar w:fldCharType="separate"/>
-            </w:r>
-            <w:r>
-              <w:rPr>
-                <w:webHidden/>
-              </w:rPr>
-              <w:t>9</w:t>
-            </w:r>
-            <w:r>
-              <w:rPr>
                 <w:webHidden/>
               </w:rPr>
               <w:fldChar w:fldCharType="end"/>
@@ -993,14 +865,14 @@
               <w14:ligatures w14:val="standardContextual"/>
             </w:rPr>
           </w:pPr>
-          <w:hyperlink w:anchor="_Toc239679999" w:history="1">
+          <w:hyperlink w:anchor="_Toc239855410" w:history="1">
             <w:r>
               <w:rPr>
                 <w:rStyle w:val="Hyperlink"/>
                 <w:rFonts w:ascii="Bierstadt Display" w:eastAsia="Calibri" w:hAnsi="Bierstadt Display"/>
                 <w:noProof/>
               </w:rPr>
-              <w:t>5.1 External analysis</w:t>
+              <w:t>4.4 The product problem</w:t>
             </w:r>
             <w:r>
               <w:rPr>
@@ -1021,7 +893,7 @@
                 <w:noProof/>
                 <w:webHidden/>
               </w:rPr>
-              <w:instrText xml:space="preserve"> PAGEREF _Toc239679999 \h </w:instrText>
+              <w:instrText xml:space="preserve"> PAGEREF _Toc239855410 \h </w:instrText>
             </w:r>
             <w:r>
               <w:rPr>
@@ -1046,6 +918,66 @@
             <w:r>
               <w:rPr>
                 <w:noProof/>
+                <w:webHidden/>
+              </w:rPr>
+              <w:fldChar w:fldCharType="end"/>
+            </w:r>
+          </w:hyperlink>
+        </w:p>
+        <w:p>
+          <w:pPr>
+            <w:pStyle w:val="TOC1"/>
+            <w:rPr>
+              <w:rFonts w:asciiTheme="minorHAnsi" w:eastAsiaTheme="minorEastAsia" w:hAnsiTheme="minorHAnsi"/>
+              <w:kern w:val="2"/>
+              <w:lang w:val="en-KE" w:eastAsia="en-KE"/>
+              <w14:ligatures w14:val="standardContextual"/>
+            </w:rPr>
+          </w:pPr>
+          <w:hyperlink w:anchor="_Toc239855411" w:history="1">
+            <w:r>
+              <w:rPr>
+                <w:rStyle w:val="Hyperlink"/>
+              </w:rPr>
+              <w:t>5. Strategic Analysis</w:t>
+            </w:r>
+            <w:r>
+              <w:rPr>
+                <w:webHidden/>
+              </w:rPr>
+              <w:tab/>
+            </w:r>
+            <w:r>
+              <w:rPr>
+                <w:webHidden/>
+              </w:rPr>
+              <w:fldChar w:fldCharType="begin"/>
+            </w:r>
+            <w:r>
+              <w:rPr>
+                <w:webHidden/>
+              </w:rPr>
+              <w:instrText xml:space="preserve"> PAGEREF _Toc239855411 \h </w:instrText>
+            </w:r>
+            <w:r>
+              <w:rPr>
+                <w:webHidden/>
+              </w:rPr>
+            </w:r>
+            <w:r>
+              <w:rPr>
+                <w:webHidden/>
+              </w:rPr>
+              <w:fldChar w:fldCharType="separate"/>
+            </w:r>
+            <w:r>
+              <w:rPr>
+                <w:webHidden/>
+              </w:rPr>
+              <w:t>9</w:t>
+            </w:r>
+            <w:r>
+              <w:rPr>
                 <w:webHidden/>
               </w:rPr>
               <w:fldChar w:fldCharType="end"/>
@@ -1065,14 +997,14 @@
               <w14:ligatures w14:val="standardContextual"/>
             </w:rPr>
           </w:pPr>
-          <w:hyperlink w:anchor="_Toc239680000" w:history="1">
+          <w:hyperlink w:anchor="_Toc239855412" w:history="1">
             <w:r>
               <w:rPr>
                 <w:rStyle w:val="Hyperlink"/>
                 <w:rFonts w:ascii="Bierstadt Display" w:eastAsia="Calibri" w:hAnsi="Bierstadt Display"/>
                 <w:noProof/>
               </w:rPr>
-              <w:t>5.2 Internal analysis</w:t>
+              <w:t>5.1 External analysis</w:t>
             </w:r>
             <w:r>
               <w:rPr>
@@ -1093,7 +1025,7 @@
                 <w:noProof/>
                 <w:webHidden/>
               </w:rPr>
-              <w:instrText xml:space="preserve"> PAGEREF _Toc239680000 \h </w:instrText>
+              <w:instrText xml:space="preserve"> PAGEREF _Toc239855412 \h </w:instrText>
             </w:r>
             <w:r>
               <w:rPr>
@@ -1113,188 +1045,11 @@
                 <w:noProof/>
                 <w:webHidden/>
               </w:rPr>
-              <w:t>10</w:t>
+              <w:t>9</w:t>
             </w:r>
             <w:r>
               <w:rPr>
                 <w:noProof/>
-                <w:webHidden/>
-              </w:rPr>
-              <w:fldChar w:fldCharType="end"/>
-            </w:r>
-          </w:hyperlink>
-        </w:p>
-        <w:p>
-          <w:pPr>
-            <w:pStyle w:val="TOC1"/>
-            <w:rPr>
-              <w:kern w:val="2"/>
-              <w:lang w:val="en-KE" w:eastAsia="en-KE"/>
-              <w14:ligatures w14:val="standardContextual"/>
-            </w:rPr>
-          </w:pPr>
-          <w:hyperlink w:anchor="_Toc239680001" w:history="1">
-            <w:r>
-              <w:rPr>
-                <w:rStyle w:val="Hyperlink"/>
-              </w:rPr>
-              <w:t>6. Analytics Opportunity</w:t>
-            </w:r>
-            <w:r>
-              <w:rPr>
-                <w:webHidden/>
-              </w:rPr>
-              <w:tab/>
-            </w:r>
-            <w:r>
-              <w:rPr>
-                <w:webHidden/>
-              </w:rPr>
-              <w:fldChar w:fldCharType="begin"/>
-            </w:r>
-            <w:r>
-              <w:rPr>
-                <w:webHidden/>
-              </w:rPr>
-              <w:instrText xml:space="preserve"> PAGEREF _Toc239680001 \h </w:instrText>
-            </w:r>
-            <w:r>
-              <w:rPr>
-                <w:webHidden/>
-              </w:rPr>
-            </w:r>
-            <w:r>
-              <w:rPr>
-                <w:webHidden/>
-              </w:rPr>
-              <w:fldChar w:fldCharType="separate"/>
-            </w:r>
-            <w:r>
-              <w:rPr>
-                <w:webHidden/>
-              </w:rPr>
-              <w:t>11</w:t>
-            </w:r>
-            <w:r>
-              <w:rPr>
-                <w:webHidden/>
-              </w:rPr>
-              <w:fldChar w:fldCharType="end"/>
-            </w:r>
-          </w:hyperlink>
-        </w:p>
-        <w:p>
-          <w:pPr>
-            <w:pStyle w:val="TOC1"/>
-            <w:rPr>
-              <w:kern w:val="2"/>
-              <w:lang w:val="en-KE" w:eastAsia="en-KE"/>
-              <w14:ligatures w14:val="standardContextual"/>
-            </w:rPr>
-          </w:pPr>
-          <w:hyperlink w:anchor="_Toc239680002" w:history="1">
-            <w:r>
-              <w:rPr>
-                <w:rStyle w:val="Hyperlink"/>
-              </w:rPr>
-              <w:t>7. Rationale</w:t>
-            </w:r>
-            <w:r>
-              <w:rPr>
-                <w:webHidden/>
-              </w:rPr>
-              <w:tab/>
-            </w:r>
-            <w:r>
-              <w:rPr>
-                <w:webHidden/>
-              </w:rPr>
-              <w:fldChar w:fldCharType="begin"/>
-            </w:r>
-            <w:r>
-              <w:rPr>
-                <w:webHidden/>
-              </w:rPr>
-              <w:instrText xml:space="preserve"> PAGEREF _Toc239680002 \h </w:instrText>
-            </w:r>
-            <w:r>
-              <w:rPr>
-                <w:webHidden/>
-              </w:rPr>
-            </w:r>
-            <w:r>
-              <w:rPr>
-                <w:webHidden/>
-              </w:rPr>
-              <w:fldChar w:fldCharType="separate"/>
-            </w:r>
-            <w:r>
-              <w:rPr>
-                <w:webHidden/>
-              </w:rPr>
-              <w:t>12</w:t>
-            </w:r>
-            <w:r>
-              <w:rPr>
-                <w:webHidden/>
-              </w:rPr>
-              <w:fldChar w:fldCharType="end"/>
-            </w:r>
-          </w:hyperlink>
-        </w:p>
-        <w:p>
-          <w:pPr>
-            <w:pStyle w:val="TOC1"/>
-            <w:rPr>
-              <w:kern w:val="2"/>
-              <w:lang w:val="en-KE" w:eastAsia="en-KE"/>
-              <w14:ligatures w14:val="standardContextual"/>
-            </w:rPr>
-          </w:pPr>
-          <w:hyperlink w:anchor="_Toc239680003" w:history="1">
-            <w:r>
-              <w:rPr>
-                <w:rStyle w:val="Hyperlink"/>
-              </w:rPr>
-              <w:t>8. Stakeholder and Requirement Analysis</w:t>
-            </w:r>
-            <w:r>
-              <w:rPr>
-                <w:webHidden/>
-              </w:rPr>
-              <w:tab/>
-            </w:r>
-            <w:r>
-              <w:rPr>
-                <w:webHidden/>
-              </w:rPr>
-              <w:fldChar w:fldCharType="begin"/>
-            </w:r>
-            <w:r>
-              <w:rPr>
-                <w:webHidden/>
-              </w:rPr>
-              <w:instrText xml:space="preserve"> PAGEREF _Toc239680003 \h </w:instrText>
-            </w:r>
-            <w:r>
-              <w:rPr>
-                <w:webHidden/>
-              </w:rPr>
-            </w:r>
-            <w:r>
-              <w:rPr>
-                <w:webHidden/>
-              </w:rPr>
-              <w:fldChar w:fldCharType="separate"/>
-            </w:r>
-            <w:r>
-              <w:rPr>
-                <w:webHidden/>
-              </w:rPr>
-              <w:t>12</w:t>
-            </w:r>
-            <w:r>
-              <w:rPr>
                 <w:webHidden/>
               </w:rPr>
               <w:fldChar w:fldCharType="end"/>
@@ -1314,14 +1069,14 @@
               <w14:ligatures w14:val="standardContextual"/>
             </w:rPr>
           </w:pPr>
-          <w:hyperlink w:anchor="_Toc239680004" w:history="1">
+          <w:hyperlink w:anchor="_Toc239855413" w:history="1">
             <w:r>
               <w:rPr>
                 <w:rStyle w:val="Hyperlink"/>
-                <w:rFonts w:ascii="Bierstadt Display" w:hAnsi="Bierstadt Display"/>
+                <w:rFonts w:ascii="Bierstadt Display" w:eastAsia="Calibri" w:hAnsi="Bierstadt Display"/>
                 <w:noProof/>
               </w:rPr>
-              <w:t>8.1 Key stakeholder questions</w:t>
+              <w:t>5.2 Internal analysis</w:t>
             </w:r>
             <w:r>
               <w:rPr>
@@ -1342,7 +1097,7 @@
                 <w:noProof/>
                 <w:webHidden/>
               </w:rPr>
-              <w:instrText xml:space="preserve"> PAGEREF _Toc239680004 \h </w:instrText>
+              <w:instrText xml:space="preserve"> PAGEREF _Toc239855413 \h </w:instrText>
             </w:r>
             <w:r>
               <w:rPr>
@@ -1362,11 +1117,191 @@
                 <w:noProof/>
                 <w:webHidden/>
               </w:rPr>
+              <w:t>10</w:t>
+            </w:r>
+            <w:r>
+              <w:rPr>
+                <w:noProof/>
+                <w:webHidden/>
+              </w:rPr>
+              <w:fldChar w:fldCharType="end"/>
+            </w:r>
+          </w:hyperlink>
+        </w:p>
+        <w:p>
+          <w:pPr>
+            <w:pStyle w:val="TOC1"/>
+            <w:rPr>
+              <w:rFonts w:asciiTheme="minorHAnsi" w:eastAsiaTheme="minorEastAsia" w:hAnsiTheme="minorHAnsi"/>
+              <w:kern w:val="2"/>
+              <w:lang w:val="en-KE" w:eastAsia="en-KE"/>
+              <w14:ligatures w14:val="standardContextual"/>
+            </w:rPr>
+          </w:pPr>
+          <w:hyperlink w:anchor="_Toc239855414" w:history="1">
+            <w:r>
+              <w:rPr>
+                <w:rStyle w:val="Hyperlink"/>
+              </w:rPr>
+              <w:t>6. Analytics Opportunity</w:t>
+            </w:r>
+            <w:r>
+              <w:rPr>
+                <w:webHidden/>
+              </w:rPr>
+              <w:tab/>
+            </w:r>
+            <w:r>
+              <w:rPr>
+                <w:webHidden/>
+              </w:rPr>
+              <w:fldChar w:fldCharType="begin"/>
+            </w:r>
+            <w:r>
+              <w:rPr>
+                <w:webHidden/>
+              </w:rPr>
+              <w:instrText xml:space="preserve"> PAGEREF _Toc239855414 \h </w:instrText>
+            </w:r>
+            <w:r>
+              <w:rPr>
+                <w:webHidden/>
+              </w:rPr>
+            </w:r>
+            <w:r>
+              <w:rPr>
+                <w:webHidden/>
+              </w:rPr>
+              <w:fldChar w:fldCharType="separate"/>
+            </w:r>
+            <w:r>
+              <w:rPr>
+                <w:webHidden/>
+              </w:rPr>
+              <w:t>11</w:t>
+            </w:r>
+            <w:r>
+              <w:rPr>
+                <w:webHidden/>
+              </w:rPr>
+              <w:fldChar w:fldCharType="end"/>
+            </w:r>
+          </w:hyperlink>
+        </w:p>
+        <w:p>
+          <w:pPr>
+            <w:pStyle w:val="TOC1"/>
+            <w:rPr>
+              <w:rFonts w:asciiTheme="minorHAnsi" w:eastAsiaTheme="minorEastAsia" w:hAnsiTheme="minorHAnsi"/>
+              <w:kern w:val="2"/>
+              <w:lang w:val="en-KE" w:eastAsia="en-KE"/>
+              <w14:ligatures w14:val="standardContextual"/>
+            </w:rPr>
+          </w:pPr>
+          <w:hyperlink w:anchor="_Toc239855415" w:history="1">
+            <w:r>
+              <w:rPr>
+                <w:rStyle w:val="Hyperlink"/>
+              </w:rPr>
+              <w:t>7. Rationale</w:t>
+            </w:r>
+            <w:r>
+              <w:rPr>
+                <w:webHidden/>
+              </w:rPr>
+              <w:tab/>
+            </w:r>
+            <w:r>
+              <w:rPr>
+                <w:webHidden/>
+              </w:rPr>
+              <w:fldChar w:fldCharType="begin"/>
+            </w:r>
+            <w:r>
+              <w:rPr>
+                <w:webHidden/>
+              </w:rPr>
+              <w:instrText xml:space="preserve"> PAGEREF _Toc239855415 \h </w:instrText>
+            </w:r>
+            <w:r>
+              <w:rPr>
+                <w:webHidden/>
+              </w:rPr>
+            </w:r>
+            <w:r>
+              <w:rPr>
+                <w:webHidden/>
+              </w:rPr>
+              <w:fldChar w:fldCharType="separate"/>
+            </w:r>
+            <w:r>
+              <w:rPr>
+                <w:webHidden/>
+              </w:rPr>
               <w:t>12</w:t>
             </w:r>
             <w:r>
               <w:rPr>
-                <w:noProof/>
+                <w:webHidden/>
+              </w:rPr>
+              <w:fldChar w:fldCharType="end"/>
+            </w:r>
+          </w:hyperlink>
+        </w:p>
+        <w:p>
+          <w:pPr>
+            <w:pStyle w:val="TOC1"/>
+            <w:rPr>
+              <w:rFonts w:asciiTheme="minorHAnsi" w:eastAsiaTheme="minorEastAsia" w:hAnsiTheme="minorHAnsi"/>
+              <w:kern w:val="2"/>
+              <w:lang w:val="en-KE" w:eastAsia="en-KE"/>
+              <w14:ligatures w14:val="standardContextual"/>
+            </w:rPr>
+          </w:pPr>
+          <w:hyperlink w:anchor="_Toc239855416" w:history="1">
+            <w:r>
+              <w:rPr>
+                <w:rStyle w:val="Hyperlink"/>
+              </w:rPr>
+              <w:t>8. Stakeholder and Requirement Analysis</w:t>
+            </w:r>
+            <w:r>
+              <w:rPr>
+                <w:webHidden/>
+              </w:rPr>
+              <w:tab/>
+            </w:r>
+            <w:r>
+              <w:rPr>
+                <w:webHidden/>
+              </w:rPr>
+              <w:fldChar w:fldCharType="begin"/>
+            </w:r>
+            <w:r>
+              <w:rPr>
+                <w:webHidden/>
+              </w:rPr>
+              <w:instrText xml:space="preserve"> PAGEREF _Toc239855416 \h </w:instrText>
+            </w:r>
+            <w:r>
+              <w:rPr>
+                <w:webHidden/>
+              </w:rPr>
+            </w:r>
+            <w:r>
+              <w:rPr>
+                <w:webHidden/>
+              </w:rPr>
+              <w:fldChar w:fldCharType="separate"/>
+            </w:r>
+            <w:r>
+              <w:rPr>
+                <w:webHidden/>
+              </w:rPr>
+              <w:t>12</w:t>
+            </w:r>
+            <w:r>
+              <w:rPr>
                 <w:webHidden/>
               </w:rPr>
               <w:fldChar w:fldCharType="end"/>
@@ -1386,14 +1321,14 @@
               <w14:ligatures w14:val="standardContextual"/>
             </w:rPr>
           </w:pPr>
-          <w:hyperlink w:anchor="_Toc239680005" w:history="1">
+          <w:hyperlink w:anchor="_Toc239855417" w:history="1">
             <w:r>
               <w:rPr>
                 <w:rStyle w:val="Hyperlink"/>
                 <w:rFonts w:ascii="Bierstadt Display" w:hAnsi="Bierstadt Display"/>
                 <w:noProof/>
               </w:rPr>
-              <w:t>8.2 Ethics, privacy, bias, and stakeholder impact</w:t>
+              <w:t>8.1 Key stakeholder questions</w:t>
             </w:r>
             <w:r>
               <w:rPr>
@@ -1414,7 +1349,7 @@
                 <w:noProof/>
                 <w:webHidden/>
               </w:rPr>
-              <w:instrText xml:space="preserve"> PAGEREF _Toc239680005 \h </w:instrText>
+              <w:instrText xml:space="preserve"> PAGEREF _Toc239855417 \h </w:instrText>
             </w:r>
             <w:r>
               <w:rPr>
@@ -1434,129 +1369,11 @@
                 <w:noProof/>
                 <w:webHidden/>
               </w:rPr>
-              <w:t>14</w:t>
+              <w:t>12</w:t>
             </w:r>
             <w:r>
               <w:rPr>
                 <w:noProof/>
-                <w:webHidden/>
-              </w:rPr>
-              <w:fldChar w:fldCharType="end"/>
-            </w:r>
-          </w:hyperlink>
-        </w:p>
-        <w:p>
-          <w:pPr>
-            <w:pStyle w:val="TOC1"/>
-            <w:rPr>
-              <w:kern w:val="2"/>
-              <w:lang w:val="en-KE" w:eastAsia="en-KE"/>
-              <w14:ligatures w14:val="standardContextual"/>
-            </w:rPr>
-          </w:pPr>
-          <w:hyperlink w:anchor="_Toc239680006" w:history="1">
-            <w:r>
-              <w:rPr>
-                <w:rStyle w:val="Hyperlink"/>
-              </w:rPr>
-              <w:t>9. Success Criteria</w:t>
-            </w:r>
-            <w:r>
-              <w:rPr>
-                <w:webHidden/>
-              </w:rPr>
-              <w:tab/>
-            </w:r>
-            <w:r>
-              <w:rPr>
-                <w:webHidden/>
-              </w:rPr>
-              <w:fldChar w:fldCharType="begin"/>
-            </w:r>
-            <w:r>
-              <w:rPr>
-                <w:webHidden/>
-              </w:rPr>
-              <w:instrText xml:space="preserve"> PAGEREF _Toc239680006 \h </w:instrText>
-            </w:r>
-            <w:r>
-              <w:rPr>
-                <w:webHidden/>
-              </w:rPr>
-            </w:r>
-            <w:r>
-              <w:rPr>
-                <w:webHidden/>
-              </w:rPr>
-              <w:fldChar w:fldCharType="separate"/>
-            </w:r>
-            <w:r>
-              <w:rPr>
-                <w:webHidden/>
-              </w:rPr>
-              <w:t>14</w:t>
-            </w:r>
-            <w:r>
-              <w:rPr>
-                <w:webHidden/>
-              </w:rPr>
-              <w:fldChar w:fldCharType="end"/>
-            </w:r>
-          </w:hyperlink>
-        </w:p>
-        <w:p>
-          <w:pPr>
-            <w:pStyle w:val="TOC1"/>
-            <w:rPr>
-              <w:kern w:val="2"/>
-              <w:lang w:val="en-KE" w:eastAsia="en-KE"/>
-              <w14:ligatures w14:val="standardContextual"/>
-            </w:rPr>
-          </w:pPr>
-          <w:hyperlink w:anchor="_Toc239680007" w:history="1">
-            <w:r>
-              <w:rPr>
-                <w:rStyle w:val="Hyperlink"/>
-              </w:rPr>
-              <w:t>10. Scope and Schedule of Deliverables</w:t>
-            </w:r>
-            <w:r>
-              <w:rPr>
-                <w:webHidden/>
-              </w:rPr>
-              <w:tab/>
-            </w:r>
-            <w:r>
-              <w:rPr>
-                <w:webHidden/>
-              </w:rPr>
-              <w:fldChar w:fldCharType="begin"/>
-            </w:r>
-            <w:r>
-              <w:rPr>
-                <w:webHidden/>
-              </w:rPr>
-              <w:instrText xml:space="preserve"> PAGEREF _Toc239680007 \h </w:instrText>
-            </w:r>
-            <w:r>
-              <w:rPr>
-                <w:webHidden/>
-              </w:rPr>
-            </w:r>
-            <w:r>
-              <w:rPr>
-                <w:webHidden/>
-              </w:rPr>
-              <w:fldChar w:fldCharType="separate"/>
-            </w:r>
-            <w:r>
-              <w:rPr>
-                <w:webHidden/>
-              </w:rPr>
-              <w:t>15</w:t>
-            </w:r>
-            <w:r>
-              <w:rPr>
                 <w:webHidden/>
               </w:rPr>
               <w:fldChar w:fldCharType="end"/>
@@ -1576,14 +1393,14 @@
               <w14:ligatures w14:val="standardContextual"/>
             </w:rPr>
           </w:pPr>
-          <w:hyperlink w:anchor="_Toc239680008" w:history="1">
+          <w:hyperlink w:anchor="_Toc239855418" w:history="1">
             <w:r>
               <w:rPr>
                 <w:rStyle w:val="Hyperlink"/>
                 <w:rFonts w:ascii="Bierstadt Display" w:hAnsi="Bierstadt Display"/>
                 <w:noProof/>
               </w:rPr>
-              <w:t>10.1 Feasibility analysis</w:t>
+              <w:t>8.2 Ethics, privacy, bias, and stakeholder impact</w:t>
             </w:r>
             <w:r>
               <w:rPr>
@@ -1604,7 +1421,7 @@
                 <w:noProof/>
                 <w:webHidden/>
               </w:rPr>
-              <w:instrText xml:space="preserve"> PAGEREF _Toc239680008 \h </w:instrText>
+              <w:instrText xml:space="preserve"> PAGEREF _Toc239855418 \h </w:instrText>
             </w:r>
             <w:r>
               <w:rPr>
@@ -1624,11 +1441,131 @@
                 <w:noProof/>
                 <w:webHidden/>
               </w:rPr>
+              <w:t>14</w:t>
+            </w:r>
+            <w:r>
+              <w:rPr>
+                <w:noProof/>
+                <w:webHidden/>
+              </w:rPr>
+              <w:fldChar w:fldCharType="end"/>
+            </w:r>
+          </w:hyperlink>
+        </w:p>
+        <w:p>
+          <w:pPr>
+            <w:pStyle w:val="TOC1"/>
+            <w:rPr>
+              <w:rFonts w:asciiTheme="minorHAnsi" w:eastAsiaTheme="minorEastAsia" w:hAnsiTheme="minorHAnsi"/>
+              <w:kern w:val="2"/>
+              <w:lang w:val="en-KE" w:eastAsia="en-KE"/>
+              <w14:ligatures w14:val="standardContextual"/>
+            </w:rPr>
+          </w:pPr>
+          <w:hyperlink w:anchor="_Toc239855419" w:history="1">
+            <w:r>
+              <w:rPr>
+                <w:rStyle w:val="Hyperlink"/>
+              </w:rPr>
+              <w:t>9. Success Criteria</w:t>
+            </w:r>
+            <w:r>
+              <w:rPr>
+                <w:webHidden/>
+              </w:rPr>
+              <w:tab/>
+            </w:r>
+            <w:r>
+              <w:rPr>
+                <w:webHidden/>
+              </w:rPr>
+              <w:fldChar w:fldCharType="begin"/>
+            </w:r>
+            <w:r>
+              <w:rPr>
+                <w:webHidden/>
+              </w:rPr>
+              <w:instrText xml:space="preserve"> PAGEREF _Toc239855419 \h </w:instrText>
+            </w:r>
+            <w:r>
+              <w:rPr>
+                <w:webHidden/>
+              </w:rPr>
+            </w:r>
+            <w:r>
+              <w:rPr>
+                <w:webHidden/>
+              </w:rPr>
+              <w:fldChar w:fldCharType="separate"/>
+            </w:r>
+            <w:r>
+              <w:rPr>
+                <w:webHidden/>
+              </w:rPr>
+              <w:t>14</w:t>
+            </w:r>
+            <w:r>
+              <w:rPr>
+                <w:webHidden/>
+              </w:rPr>
+              <w:fldChar w:fldCharType="end"/>
+            </w:r>
+          </w:hyperlink>
+        </w:p>
+        <w:p>
+          <w:pPr>
+            <w:pStyle w:val="TOC1"/>
+            <w:rPr>
+              <w:rFonts w:asciiTheme="minorHAnsi" w:eastAsiaTheme="minorEastAsia" w:hAnsiTheme="minorHAnsi"/>
+              <w:kern w:val="2"/>
+              <w:lang w:val="en-KE" w:eastAsia="en-KE"/>
+              <w14:ligatures w14:val="standardContextual"/>
+            </w:rPr>
+          </w:pPr>
+          <w:hyperlink w:anchor="_Toc239855420" w:history="1">
+            <w:r>
+              <w:rPr>
+                <w:rStyle w:val="Hyperlink"/>
+              </w:rPr>
+              <w:t>10. Scope and Schedule of Deliverables</w:t>
+            </w:r>
+            <w:r>
+              <w:rPr>
+                <w:webHidden/>
+              </w:rPr>
+              <w:tab/>
+            </w:r>
+            <w:r>
+              <w:rPr>
+                <w:webHidden/>
+              </w:rPr>
+              <w:fldChar w:fldCharType="begin"/>
+            </w:r>
+            <w:r>
+              <w:rPr>
+                <w:webHidden/>
+              </w:rPr>
+              <w:instrText xml:space="preserve"> PAGEREF _Toc239855420 \h </w:instrText>
+            </w:r>
+            <w:r>
+              <w:rPr>
+                <w:webHidden/>
+              </w:rPr>
+            </w:r>
+            <w:r>
+              <w:rPr>
+                <w:webHidden/>
+              </w:rPr>
+              <w:fldChar w:fldCharType="separate"/>
+            </w:r>
+            <w:r>
+              <w:rPr>
+                <w:webHidden/>
+              </w:rPr>
               <w:t>15</w:t>
             </w:r>
             <w:r>
               <w:rPr>
-                <w:noProof/>
                 <w:webHidden/>
               </w:rPr>
               <w:fldChar w:fldCharType="end"/>
@@ -1648,14 +1585,14 @@
               <w14:ligatures w14:val="standardContextual"/>
             </w:rPr>
           </w:pPr>
-          <w:hyperlink w:anchor="_Toc239680009" w:history="1">
+          <w:hyperlink w:anchor="_Toc239855421" w:history="1">
             <w:r>
               <w:rPr>
                 <w:rStyle w:val="Hyperlink"/>
                 <w:rFonts w:ascii="Bierstadt Display" w:hAnsi="Bierstadt Display"/>
                 <w:noProof/>
               </w:rPr>
-              <w:t>10.2 Scope</w:t>
+              <w:t>10.1 Feasibility analysis</w:t>
             </w:r>
             <w:r>
               <w:rPr>
@@ -1676,7 +1613,7 @@
                 <w:noProof/>
                 <w:webHidden/>
               </w:rPr>
-              <w:instrText xml:space="preserve"> PAGEREF _Toc239680009 \h </w:instrText>
+              <w:instrText xml:space="preserve"> PAGEREF _Toc239855421 \h </w:instrText>
             </w:r>
             <w:r>
               <w:rPr>
@@ -1696,7 +1633,7 @@
                 <w:noProof/>
                 <w:webHidden/>
               </w:rPr>
-              <w:t>16</w:t>
+              <w:t>15</w:t>
             </w:r>
             <w:r>
               <w:rPr>
@@ -1720,14 +1657,14 @@
               <w14:ligatures w14:val="standardContextual"/>
             </w:rPr>
           </w:pPr>
-          <w:hyperlink w:anchor="_Toc239680010" w:history="1">
+          <w:hyperlink w:anchor="_Toc239855422" w:history="1">
             <w:r>
               <w:rPr>
                 <w:rStyle w:val="Hyperlink"/>
                 <w:rFonts w:ascii="Bierstadt Display" w:hAnsi="Bierstadt Display"/>
                 <w:noProof/>
               </w:rPr>
-              <w:t>10.3 Deliverables and schedule</w:t>
+              <w:t>10.2 Scope</w:t>
             </w:r>
             <w:r>
               <w:rPr>
@@ -1748,7 +1685,7 @@
                 <w:noProof/>
                 <w:webHidden/>
               </w:rPr>
-              <w:instrText xml:space="preserve"> PAGEREF _Toc239680010 \h </w:instrText>
+              <w:instrText xml:space="preserve"> PAGEREF _Toc239855422 \h </w:instrText>
             </w:r>
             <w:r>
               <w:rPr>
@@ -1773,65 +1710,6 @@
             <w:r>
               <w:rPr>
                 <w:noProof/>
-                <w:webHidden/>
-              </w:rPr>
-              <w:fldChar w:fldCharType="end"/>
-            </w:r>
-          </w:hyperlink>
-        </w:p>
-        <w:p>
-          <w:pPr>
-            <w:pStyle w:val="TOC1"/>
-            <w:rPr>
-              <w:kern w:val="2"/>
-              <w:lang w:val="en-KE" w:eastAsia="en-KE"/>
-              <w14:ligatures w14:val="standardContextual"/>
-            </w:rPr>
-          </w:pPr>
-          <w:hyperlink w:anchor="_Toc239680011" w:history="1">
-            <w:r>
-              <w:rPr>
-                <w:rStyle w:val="Hyperlink"/>
-              </w:rPr>
-              <w:t>11. Data Understanding</w:t>
-            </w:r>
-            <w:r>
-              <w:rPr>
-                <w:webHidden/>
-              </w:rPr>
-              <w:tab/>
-            </w:r>
-            <w:r>
-              <w:rPr>
-                <w:webHidden/>
-              </w:rPr>
-              <w:fldChar w:fldCharType="begin"/>
-            </w:r>
-            <w:r>
-              <w:rPr>
-                <w:webHidden/>
-              </w:rPr>
-              <w:instrText xml:space="preserve"> PAGEREF _Toc239680011 \h </w:instrText>
-            </w:r>
-            <w:r>
-              <w:rPr>
-                <w:webHidden/>
-              </w:rPr>
-            </w:r>
-            <w:r>
-              <w:rPr>
-                <w:webHidden/>
-              </w:rPr>
-              <w:fldChar w:fldCharType="separate"/>
-            </w:r>
-            <w:r>
-              <w:rPr>
-                <w:webHidden/>
-              </w:rPr>
-              <w:t>17</w:t>
-            </w:r>
-            <w:r>
-              <w:rPr>
                 <w:webHidden/>
               </w:rPr>
               <w:fldChar w:fldCharType="end"/>
@@ -1851,14 +1729,14 @@
               <w14:ligatures w14:val="standardContextual"/>
             </w:rPr>
           </w:pPr>
-          <w:hyperlink w:anchor="_Toc239680012" w:history="1">
+          <w:hyperlink w:anchor="_Toc239855423" w:history="1">
             <w:r>
               <w:rPr>
                 <w:rStyle w:val="Hyperlink"/>
-                <w:rFonts w:ascii="Bierstadt Display" w:eastAsia="Calibri" w:hAnsi="Bierstadt Display"/>
+                <w:rFonts w:ascii="Bierstadt Display" w:hAnsi="Bierstadt Display"/>
                 <w:noProof/>
               </w:rPr>
-              <w:t>11.1 Why the cohort is synthetic</w:t>
+              <w:t>10.3 Deliverables and schedule</w:t>
             </w:r>
             <w:r>
               <w:rPr>
@@ -1879,7 +1757,7 @@
                 <w:noProof/>
                 <w:webHidden/>
               </w:rPr>
-              <w:instrText xml:space="preserve"> PAGEREF _Toc239680012 \h </w:instrText>
+              <w:instrText xml:space="preserve"> PAGEREF _Toc239855423 \h </w:instrText>
             </w:r>
             <w:r>
               <w:rPr>
@@ -1899,11 +1777,71 @@
                 <w:noProof/>
                 <w:webHidden/>
               </w:rPr>
+              <w:t>16</w:t>
+            </w:r>
+            <w:r>
+              <w:rPr>
+                <w:noProof/>
+                <w:webHidden/>
+              </w:rPr>
+              <w:fldChar w:fldCharType="end"/>
+            </w:r>
+          </w:hyperlink>
+        </w:p>
+        <w:p>
+          <w:pPr>
+            <w:pStyle w:val="TOC1"/>
+            <w:rPr>
+              <w:rFonts w:asciiTheme="minorHAnsi" w:eastAsiaTheme="minorEastAsia" w:hAnsiTheme="minorHAnsi"/>
+              <w:kern w:val="2"/>
+              <w:lang w:val="en-KE" w:eastAsia="en-KE"/>
+              <w14:ligatures w14:val="standardContextual"/>
+            </w:rPr>
+          </w:pPr>
+          <w:hyperlink w:anchor="_Toc239855424" w:history="1">
+            <w:r>
+              <w:rPr>
+                <w:rStyle w:val="Hyperlink"/>
+              </w:rPr>
+              <w:t>11. Data Understanding</w:t>
+            </w:r>
+            <w:r>
+              <w:rPr>
+                <w:webHidden/>
+              </w:rPr>
+              <w:tab/>
+            </w:r>
+            <w:r>
+              <w:rPr>
+                <w:webHidden/>
+              </w:rPr>
+              <w:fldChar w:fldCharType="begin"/>
+            </w:r>
+            <w:r>
+              <w:rPr>
+                <w:webHidden/>
+              </w:rPr>
+              <w:instrText xml:space="preserve"> PAGEREF _Toc239855424 \h </w:instrText>
+            </w:r>
+            <w:r>
+              <w:rPr>
+                <w:webHidden/>
+              </w:rPr>
+            </w:r>
+            <w:r>
+              <w:rPr>
+                <w:webHidden/>
+              </w:rPr>
+              <w:fldChar w:fldCharType="separate"/>
+            </w:r>
+            <w:r>
+              <w:rPr>
+                <w:webHidden/>
+              </w:rPr>
               <w:t>17</w:t>
             </w:r>
             <w:r>
               <w:rPr>
-                <w:noProof/>
                 <w:webHidden/>
               </w:rPr>
               <w:fldChar w:fldCharType="end"/>
@@ -1923,14 +1861,14 @@
               <w14:ligatures w14:val="standardContextual"/>
             </w:rPr>
           </w:pPr>
-          <w:hyperlink w:anchor="_Toc239680013" w:history="1">
+          <w:hyperlink w:anchor="_Toc239855425" w:history="1">
             <w:r>
               <w:rPr>
                 <w:rStyle w:val="Hyperlink"/>
                 <w:rFonts w:ascii="Bierstadt Display" w:eastAsia="Calibri" w:hAnsi="Bierstadt Display"/>
                 <w:noProof/>
               </w:rPr>
-              <w:t>11.2 A three-layer dictionary: separating money and risk</w:t>
+              <w:t>11.1 Why the cohort is synthetic</w:t>
             </w:r>
             <w:r>
               <w:rPr>
@@ -1951,7 +1889,7 @@
                 <w:noProof/>
                 <w:webHidden/>
               </w:rPr>
-              <w:instrText xml:space="preserve"> PAGEREF _Toc239680013 \h </w:instrText>
+              <w:instrText xml:space="preserve"> PAGEREF _Toc239855425 \h </w:instrText>
             </w:r>
             <w:r>
               <w:rPr>
@@ -1971,7 +1909,7 @@
                 <w:noProof/>
                 <w:webHidden/>
               </w:rPr>
-              <w:t>18</w:t>
+              <w:t>17</w:t>
             </w:r>
             <w:r>
               <w:rPr>
@@ -1995,14 +1933,14 @@
               <w14:ligatures w14:val="standardContextual"/>
             </w:rPr>
           </w:pPr>
-          <w:hyperlink w:anchor="_Toc239680014" w:history="1">
+          <w:hyperlink w:anchor="_Toc239855426" w:history="1">
             <w:r>
               <w:rPr>
                 <w:rStyle w:val="Hyperlink"/>
                 <w:rFonts w:ascii="Bierstadt Display" w:eastAsia="Calibri" w:hAnsi="Bierstadt Display"/>
                 <w:noProof/>
               </w:rPr>
-              <w:t>11.4 Dynamic pressure and real-world collection realism</w:t>
+              <w:t>11.2 A three-layer dictionary: separating money and risk</w:t>
             </w:r>
             <w:r>
               <w:rPr>
@@ -2023,7 +1961,7 @@
                 <w:noProof/>
                 <w:webHidden/>
               </w:rPr>
-              <w:instrText xml:space="preserve"> PAGEREF _Toc239680014 \h </w:instrText>
+              <w:instrText xml:space="preserve"> PAGEREF _Toc239855426 \h </w:instrText>
             </w:r>
             <w:r>
               <w:rPr>
@@ -2043,188 +1981,11 @@
                 <w:noProof/>
                 <w:webHidden/>
               </w:rPr>
-              <w:t>19</w:t>
+              <w:t>18</w:t>
             </w:r>
             <w:r>
               <w:rPr>
                 <w:noProof/>
-                <w:webHidden/>
-              </w:rPr>
-              <w:fldChar w:fldCharType="end"/>
-            </w:r>
-          </w:hyperlink>
-        </w:p>
-        <w:p>
-          <w:pPr>
-            <w:pStyle w:val="TOC1"/>
-            <w:rPr>
-              <w:kern w:val="2"/>
-              <w:lang w:val="en-KE" w:eastAsia="en-KE"/>
-              <w14:ligatures w14:val="standardContextual"/>
-            </w:rPr>
-          </w:pPr>
-          <w:hyperlink w:anchor="_Toc239680015" w:history="1">
-            <w:r>
-              <w:rPr>
-                <w:rStyle w:val="Hyperlink"/>
-              </w:rPr>
-              <w:t>12. Data Preparation</w:t>
-            </w:r>
-            <w:r>
-              <w:rPr>
-                <w:webHidden/>
-              </w:rPr>
-              <w:tab/>
-            </w:r>
-            <w:r>
-              <w:rPr>
-                <w:webHidden/>
-              </w:rPr>
-              <w:fldChar w:fldCharType="begin"/>
-            </w:r>
-            <w:r>
-              <w:rPr>
-                <w:webHidden/>
-              </w:rPr>
-              <w:instrText xml:space="preserve"> PAGEREF _Toc239680015 \h </w:instrText>
-            </w:r>
-            <w:r>
-              <w:rPr>
-                <w:webHidden/>
-              </w:rPr>
-            </w:r>
-            <w:r>
-              <w:rPr>
-                <w:webHidden/>
-              </w:rPr>
-              <w:fldChar w:fldCharType="separate"/>
-            </w:r>
-            <w:r>
-              <w:rPr>
-                <w:webHidden/>
-              </w:rPr>
-              <w:t>20</w:t>
-            </w:r>
-            <w:r>
-              <w:rPr>
-                <w:webHidden/>
-              </w:rPr>
-              <w:fldChar w:fldCharType="end"/>
-            </w:r>
-          </w:hyperlink>
-        </w:p>
-        <w:p>
-          <w:pPr>
-            <w:pStyle w:val="TOC1"/>
-            <w:rPr>
-              <w:kern w:val="2"/>
-              <w:lang w:val="en-KE" w:eastAsia="en-KE"/>
-              <w14:ligatures w14:val="standardContextual"/>
-            </w:rPr>
-          </w:pPr>
-          <w:hyperlink w:anchor="_Toc239680016" w:history="1">
-            <w:r>
-              <w:rPr>
-                <w:rStyle w:val="Hyperlink"/>
-              </w:rPr>
-              <w:t>13. Exploratory Data Analysis</w:t>
-            </w:r>
-            <w:r>
-              <w:rPr>
-                <w:webHidden/>
-              </w:rPr>
-              <w:tab/>
-            </w:r>
-            <w:r>
-              <w:rPr>
-                <w:webHidden/>
-              </w:rPr>
-              <w:fldChar w:fldCharType="begin"/>
-            </w:r>
-            <w:r>
-              <w:rPr>
-                <w:webHidden/>
-              </w:rPr>
-              <w:instrText xml:space="preserve"> PAGEREF _Toc239680016 \h </w:instrText>
-            </w:r>
-            <w:r>
-              <w:rPr>
-                <w:webHidden/>
-              </w:rPr>
-            </w:r>
-            <w:r>
-              <w:rPr>
-                <w:webHidden/>
-              </w:rPr>
-              <w:fldChar w:fldCharType="separate"/>
-            </w:r>
-            <w:r>
-              <w:rPr>
-                <w:webHidden/>
-              </w:rPr>
-              <w:t>21</w:t>
-            </w:r>
-            <w:r>
-              <w:rPr>
-                <w:webHidden/>
-              </w:rPr>
-              <w:fldChar w:fldCharType="end"/>
-            </w:r>
-          </w:hyperlink>
-        </w:p>
-        <w:p>
-          <w:pPr>
-            <w:pStyle w:val="TOC1"/>
-            <w:rPr>
-              <w:kern w:val="2"/>
-              <w:lang w:val="en-KE" w:eastAsia="en-KE"/>
-              <w14:ligatures w14:val="standardContextual"/>
-            </w:rPr>
-          </w:pPr>
-          <w:hyperlink w:anchor="_Toc239680017" w:history="1">
-            <w:r>
-              <w:rPr>
-                <w:rStyle w:val="Hyperlink"/>
-              </w:rPr>
-              <w:t>14. Methods and Frameworks</w:t>
-            </w:r>
-            <w:r>
-              <w:rPr>
-                <w:webHidden/>
-              </w:rPr>
-              <w:tab/>
-            </w:r>
-            <w:r>
-              <w:rPr>
-                <w:webHidden/>
-              </w:rPr>
-              <w:fldChar w:fldCharType="begin"/>
-            </w:r>
-            <w:r>
-              <w:rPr>
-                <w:webHidden/>
-              </w:rPr>
-              <w:instrText xml:space="preserve"> PAGEREF _Toc239680017 \h </w:instrText>
-            </w:r>
-            <w:r>
-              <w:rPr>
-                <w:webHidden/>
-              </w:rPr>
-            </w:r>
-            <w:r>
-              <w:rPr>
-                <w:webHidden/>
-              </w:rPr>
-              <w:fldChar w:fldCharType="separate"/>
-            </w:r>
-            <w:r>
-              <w:rPr>
-                <w:webHidden/>
-              </w:rPr>
-              <w:t>23</w:t>
-            </w:r>
-            <w:r>
-              <w:rPr>
                 <w:webHidden/>
               </w:rPr>
               <w:fldChar w:fldCharType="end"/>
@@ -2244,14 +2005,14 @@
               <w14:ligatures w14:val="standardContextual"/>
             </w:rPr>
           </w:pPr>
-          <w:hyperlink w:anchor="_Toc239680018" w:history="1">
+          <w:hyperlink w:anchor="_Toc239855427" w:history="1">
             <w:r>
               <w:rPr>
                 <w:rStyle w:val="Hyperlink"/>
-                <w:rFonts w:ascii="Bierstadt Display" w:hAnsi="Bierstadt Display"/>
+                <w:rFonts w:ascii="Bierstadt Display" w:eastAsia="Calibri" w:hAnsi="Bierstadt Display"/>
                 <w:noProof/>
               </w:rPr>
-              <w:t>14.1 Overall approach</w:t>
+              <w:t>11.4 Dynamic pressure and real-world collection realism</w:t>
             </w:r>
             <w:r>
               <w:rPr>
@@ -2272,7 +2033,7 @@
                 <w:noProof/>
                 <w:webHidden/>
               </w:rPr>
-              <w:instrText xml:space="preserve"> PAGEREF _Toc239680018 \h </w:instrText>
+              <w:instrText xml:space="preserve"> PAGEREF _Toc239855427 \h </w:instrText>
             </w:r>
             <w:r>
               <w:rPr>
@@ -2292,11 +2053,191 @@
                 <w:noProof/>
                 <w:webHidden/>
               </w:rPr>
+              <w:t>19</w:t>
+            </w:r>
+            <w:r>
+              <w:rPr>
+                <w:noProof/>
+                <w:webHidden/>
+              </w:rPr>
+              <w:fldChar w:fldCharType="end"/>
+            </w:r>
+          </w:hyperlink>
+        </w:p>
+        <w:p>
+          <w:pPr>
+            <w:pStyle w:val="TOC1"/>
+            <w:rPr>
+              <w:rFonts w:asciiTheme="minorHAnsi" w:eastAsiaTheme="minorEastAsia" w:hAnsiTheme="minorHAnsi"/>
+              <w:kern w:val="2"/>
+              <w:lang w:val="en-KE" w:eastAsia="en-KE"/>
+              <w14:ligatures w14:val="standardContextual"/>
+            </w:rPr>
+          </w:pPr>
+          <w:hyperlink w:anchor="_Toc239855428" w:history="1">
+            <w:r>
+              <w:rPr>
+                <w:rStyle w:val="Hyperlink"/>
+              </w:rPr>
+              <w:t>12. Data Preparation</w:t>
+            </w:r>
+            <w:r>
+              <w:rPr>
+                <w:webHidden/>
+              </w:rPr>
+              <w:tab/>
+            </w:r>
+            <w:r>
+              <w:rPr>
+                <w:webHidden/>
+              </w:rPr>
+              <w:fldChar w:fldCharType="begin"/>
+            </w:r>
+            <w:r>
+              <w:rPr>
+                <w:webHidden/>
+              </w:rPr>
+              <w:instrText xml:space="preserve"> PAGEREF _Toc239855428 \h </w:instrText>
+            </w:r>
+            <w:r>
+              <w:rPr>
+                <w:webHidden/>
+              </w:rPr>
+            </w:r>
+            <w:r>
+              <w:rPr>
+                <w:webHidden/>
+              </w:rPr>
+              <w:fldChar w:fldCharType="separate"/>
+            </w:r>
+            <w:r>
+              <w:rPr>
+                <w:webHidden/>
+              </w:rPr>
+              <w:t>20</w:t>
+            </w:r>
+            <w:r>
+              <w:rPr>
+                <w:webHidden/>
+              </w:rPr>
+              <w:fldChar w:fldCharType="end"/>
+            </w:r>
+          </w:hyperlink>
+        </w:p>
+        <w:p>
+          <w:pPr>
+            <w:pStyle w:val="TOC1"/>
+            <w:rPr>
+              <w:rFonts w:asciiTheme="minorHAnsi" w:eastAsiaTheme="minorEastAsia" w:hAnsiTheme="minorHAnsi"/>
+              <w:kern w:val="2"/>
+              <w:lang w:val="en-KE" w:eastAsia="en-KE"/>
+              <w14:ligatures w14:val="standardContextual"/>
+            </w:rPr>
+          </w:pPr>
+          <w:hyperlink w:anchor="_Toc239855429" w:history="1">
+            <w:r>
+              <w:rPr>
+                <w:rStyle w:val="Hyperlink"/>
+              </w:rPr>
+              <w:t>13. Exploratory Data Analysis</w:t>
+            </w:r>
+            <w:r>
+              <w:rPr>
+                <w:webHidden/>
+              </w:rPr>
+              <w:tab/>
+            </w:r>
+            <w:r>
+              <w:rPr>
+                <w:webHidden/>
+              </w:rPr>
+              <w:fldChar w:fldCharType="begin"/>
+            </w:r>
+            <w:r>
+              <w:rPr>
+                <w:webHidden/>
+              </w:rPr>
+              <w:instrText xml:space="preserve"> PAGEREF _Toc239855429 \h </w:instrText>
+            </w:r>
+            <w:r>
+              <w:rPr>
+                <w:webHidden/>
+              </w:rPr>
+            </w:r>
+            <w:r>
+              <w:rPr>
+                <w:webHidden/>
+              </w:rPr>
+              <w:fldChar w:fldCharType="separate"/>
+            </w:r>
+            <w:r>
+              <w:rPr>
+                <w:webHidden/>
+              </w:rPr>
+              <w:t>21</w:t>
+            </w:r>
+            <w:r>
+              <w:rPr>
+                <w:webHidden/>
+              </w:rPr>
+              <w:fldChar w:fldCharType="end"/>
+            </w:r>
+          </w:hyperlink>
+        </w:p>
+        <w:p>
+          <w:pPr>
+            <w:pStyle w:val="TOC1"/>
+            <w:rPr>
+              <w:rFonts w:asciiTheme="minorHAnsi" w:eastAsiaTheme="minorEastAsia" w:hAnsiTheme="minorHAnsi"/>
+              <w:kern w:val="2"/>
+              <w:lang w:val="en-KE" w:eastAsia="en-KE"/>
+              <w14:ligatures w14:val="standardContextual"/>
+            </w:rPr>
+          </w:pPr>
+          <w:hyperlink w:anchor="_Toc239855430" w:history="1">
+            <w:r>
+              <w:rPr>
+                <w:rStyle w:val="Hyperlink"/>
+              </w:rPr>
+              <w:t>14. Methods and Frameworks</w:t>
+            </w:r>
+            <w:r>
+              <w:rPr>
+                <w:webHidden/>
+              </w:rPr>
+              <w:tab/>
+            </w:r>
+            <w:r>
+              <w:rPr>
+                <w:webHidden/>
+              </w:rPr>
+              <w:fldChar w:fldCharType="begin"/>
+            </w:r>
+            <w:r>
+              <w:rPr>
+                <w:webHidden/>
+              </w:rPr>
+              <w:instrText xml:space="preserve"> PAGEREF _Toc239855430 \h </w:instrText>
+            </w:r>
+            <w:r>
+              <w:rPr>
+                <w:webHidden/>
+              </w:rPr>
+            </w:r>
+            <w:r>
+              <w:rPr>
+                <w:webHidden/>
+              </w:rPr>
+              <w:fldChar w:fldCharType="separate"/>
+            </w:r>
+            <w:r>
+              <w:rPr>
+                <w:webHidden/>
+              </w:rPr>
               <w:t>23</w:t>
             </w:r>
             <w:r>
               <w:rPr>
-                <w:noProof/>
                 <w:webHidden/>
               </w:rPr>
               <w:fldChar w:fldCharType="end"/>
@@ -2316,14 +2257,14 @@
               <w14:ligatures w14:val="standardContextual"/>
             </w:rPr>
           </w:pPr>
-          <w:hyperlink w:anchor="_Toc239680019" w:history="1">
+          <w:hyperlink w:anchor="_Toc239855431" w:history="1">
             <w:r>
               <w:rPr>
                 <w:rStyle w:val="Hyperlink"/>
                 <w:rFonts w:ascii="Bierstadt Display" w:hAnsi="Bierstadt Display"/>
                 <w:noProof/>
               </w:rPr>
-              <w:t>14.2 Tools and technologies</w:t>
+              <w:t>14.1 Overall approach</w:t>
             </w:r>
             <w:r>
               <w:rPr>
@@ -2344,7 +2285,7 @@
                 <w:noProof/>
                 <w:webHidden/>
               </w:rPr>
-              <w:instrText xml:space="preserve"> PAGEREF _Toc239680019 \h </w:instrText>
+              <w:instrText xml:space="preserve"> PAGEREF _Toc239855431 \h </w:instrText>
             </w:r>
             <w:r>
               <w:rPr>
@@ -2388,14 +2329,14 @@
               <w14:ligatures w14:val="standardContextual"/>
             </w:rPr>
           </w:pPr>
-          <w:hyperlink w:anchor="_Toc239680020" w:history="1">
+          <w:hyperlink w:anchor="_Toc239855432" w:history="1">
             <w:r>
               <w:rPr>
                 <w:rStyle w:val="Hyperlink"/>
                 <w:rFonts w:ascii="Bierstadt Display" w:hAnsi="Bierstadt Display"/>
                 <w:noProof/>
               </w:rPr>
-              <w:t>14.3 Alignment with project goals</w:t>
+              <w:t>14.2 Tools and technologies</w:t>
             </w:r>
             <w:r>
               <w:rPr>
@@ -2416,7 +2357,7 @@
                 <w:noProof/>
                 <w:webHidden/>
               </w:rPr>
-              <w:instrText xml:space="preserve"> PAGEREF _Toc239680020 \h </w:instrText>
+              <w:instrText xml:space="preserve"> PAGEREF _Toc239855432 \h </w:instrText>
             </w:r>
             <w:r>
               <w:rPr>
@@ -2460,14 +2401,14 @@
               <w14:ligatures w14:val="standardContextual"/>
             </w:rPr>
           </w:pPr>
-          <w:hyperlink w:anchor="_Toc239680021" w:history="1">
+          <w:hyperlink w:anchor="_Toc239855433" w:history="1">
             <w:r>
               <w:rPr>
                 <w:rStyle w:val="Hyperlink"/>
                 <w:rFonts w:ascii="Bierstadt Display" w:hAnsi="Bierstadt Display"/>
                 <w:noProof/>
               </w:rPr>
-              <w:t>14.4 Error trade-offs (why recall is the business metric)</w:t>
+              <w:t>14.3 Alignment with project goals</w:t>
             </w:r>
             <w:r>
               <w:rPr>
@@ -2488,7 +2429,7 @@
                 <w:noProof/>
                 <w:webHidden/>
               </w:rPr>
-              <w:instrText xml:space="preserve"> PAGEREF _Toc239680021 \h </w:instrText>
+              <w:instrText xml:space="preserve"> PAGEREF _Toc239855433 \h </w:instrText>
             </w:r>
             <w:r>
               <w:rPr>
@@ -2508,129 +2449,11 @@
                 <w:noProof/>
                 <w:webHidden/>
               </w:rPr>
-              <w:t>24</w:t>
+              <w:t>23</w:t>
             </w:r>
             <w:r>
               <w:rPr>
                 <w:noProof/>
-                <w:webHidden/>
-              </w:rPr>
-              <w:fldChar w:fldCharType="end"/>
-            </w:r>
-          </w:hyperlink>
-        </w:p>
-        <w:p>
-          <w:pPr>
-            <w:pStyle w:val="TOC1"/>
-            <w:rPr>
-              <w:kern w:val="2"/>
-              <w:lang w:val="en-KE" w:eastAsia="en-KE"/>
-              <w14:ligatures w14:val="standardContextual"/>
-            </w:rPr>
-          </w:pPr>
-          <w:hyperlink w:anchor="_Toc239680022" w:history="1">
-            <w:r>
-              <w:rPr>
-                <w:rStyle w:val="Hyperlink"/>
-              </w:rPr>
-              <w:t>15. Solution Architecture</w:t>
-            </w:r>
-            <w:r>
-              <w:rPr>
-                <w:webHidden/>
-              </w:rPr>
-              <w:tab/>
-            </w:r>
-            <w:r>
-              <w:rPr>
-                <w:webHidden/>
-              </w:rPr>
-              <w:fldChar w:fldCharType="begin"/>
-            </w:r>
-            <w:r>
-              <w:rPr>
-                <w:webHidden/>
-              </w:rPr>
-              <w:instrText xml:space="preserve"> PAGEREF _Toc239680022 \h </w:instrText>
-            </w:r>
-            <w:r>
-              <w:rPr>
-                <w:webHidden/>
-              </w:rPr>
-            </w:r>
-            <w:r>
-              <w:rPr>
-                <w:webHidden/>
-              </w:rPr>
-              <w:fldChar w:fldCharType="separate"/>
-            </w:r>
-            <w:r>
-              <w:rPr>
-                <w:webHidden/>
-              </w:rPr>
-              <w:t>31</w:t>
-            </w:r>
-            <w:r>
-              <w:rPr>
-                <w:webHidden/>
-              </w:rPr>
-              <w:fldChar w:fldCharType="end"/>
-            </w:r>
-          </w:hyperlink>
-        </w:p>
-        <w:p>
-          <w:pPr>
-            <w:pStyle w:val="TOC1"/>
-            <w:rPr>
-              <w:kern w:val="2"/>
-              <w:lang w:val="en-KE" w:eastAsia="en-KE"/>
-              <w14:ligatures w14:val="standardContextual"/>
-            </w:rPr>
-          </w:pPr>
-          <w:hyperlink w:anchor="_Toc239680023" w:history="1">
-            <w:r>
-              <w:rPr>
-                <w:rStyle w:val="Hyperlink"/>
-              </w:rPr>
-              <w:t>16. Cost Analysis</w:t>
-            </w:r>
-            <w:r>
-              <w:rPr>
-                <w:webHidden/>
-              </w:rPr>
-              <w:tab/>
-            </w:r>
-            <w:r>
-              <w:rPr>
-                <w:webHidden/>
-              </w:rPr>
-              <w:fldChar w:fldCharType="begin"/>
-            </w:r>
-            <w:r>
-              <w:rPr>
-                <w:webHidden/>
-              </w:rPr>
-              <w:instrText xml:space="preserve"> PAGEREF _Toc239680023 \h </w:instrText>
-            </w:r>
-            <w:r>
-              <w:rPr>
-                <w:webHidden/>
-              </w:rPr>
-            </w:r>
-            <w:r>
-              <w:rPr>
-                <w:webHidden/>
-              </w:rPr>
-              <w:fldChar w:fldCharType="separate"/>
-            </w:r>
-            <w:r>
-              <w:rPr>
-                <w:webHidden/>
-              </w:rPr>
-              <w:t>32</w:t>
-            </w:r>
-            <w:r>
-              <w:rPr>
                 <w:webHidden/>
               </w:rPr>
               <w:fldChar w:fldCharType="end"/>
@@ -2650,14 +2473,14 @@
               <w14:ligatures w14:val="standardContextual"/>
             </w:rPr>
           </w:pPr>
-          <w:hyperlink w:anchor="_Toc239680024" w:history="1">
+          <w:hyperlink w:anchor="_Toc239855434" w:history="1">
             <w:r>
               <w:rPr>
                 <w:rStyle w:val="Hyperlink"/>
                 <w:rFonts w:ascii="Bierstadt Display" w:hAnsi="Bierstadt Display"/>
                 <w:noProof/>
               </w:rPr>
-              <w:t>16.1 Capital requirements</w:t>
+              <w:t>14.4 Error trade-offs (why recall is the business metric)</w:t>
             </w:r>
             <w:r>
               <w:rPr>
@@ -2678,7 +2501,7 @@
                 <w:noProof/>
                 <w:webHidden/>
               </w:rPr>
-              <w:instrText xml:space="preserve"> PAGEREF _Toc239680024 \h </w:instrText>
+              <w:instrText xml:space="preserve"> PAGEREF _Toc239855434 \h </w:instrText>
             </w:r>
             <w:r>
               <w:rPr>
@@ -2698,11 +2521,131 @@
                 <w:noProof/>
                 <w:webHidden/>
               </w:rPr>
-              <w:t>33</w:t>
+              <w:t>24</w:t>
             </w:r>
             <w:r>
               <w:rPr>
                 <w:noProof/>
+                <w:webHidden/>
+              </w:rPr>
+              <w:fldChar w:fldCharType="end"/>
+            </w:r>
+          </w:hyperlink>
+        </w:p>
+        <w:p>
+          <w:pPr>
+            <w:pStyle w:val="TOC1"/>
+            <w:rPr>
+              <w:rFonts w:asciiTheme="minorHAnsi" w:eastAsiaTheme="minorEastAsia" w:hAnsiTheme="minorHAnsi"/>
+              <w:kern w:val="2"/>
+              <w:lang w:val="en-KE" w:eastAsia="en-KE"/>
+              <w14:ligatures w14:val="standardContextual"/>
+            </w:rPr>
+          </w:pPr>
+          <w:hyperlink w:anchor="_Toc239855435" w:history="1">
+            <w:r>
+              <w:rPr>
+                <w:rStyle w:val="Hyperlink"/>
+              </w:rPr>
+              <w:t>15. Solution Architecture</w:t>
+            </w:r>
+            <w:r>
+              <w:rPr>
+                <w:webHidden/>
+              </w:rPr>
+              <w:tab/>
+            </w:r>
+            <w:r>
+              <w:rPr>
+                <w:webHidden/>
+              </w:rPr>
+              <w:fldChar w:fldCharType="begin"/>
+            </w:r>
+            <w:r>
+              <w:rPr>
+                <w:webHidden/>
+              </w:rPr>
+              <w:instrText xml:space="preserve"> PAGEREF _Toc239855435 \h </w:instrText>
+            </w:r>
+            <w:r>
+              <w:rPr>
+                <w:webHidden/>
+              </w:rPr>
+            </w:r>
+            <w:r>
+              <w:rPr>
+                <w:webHidden/>
+              </w:rPr>
+              <w:fldChar w:fldCharType="separate"/>
+            </w:r>
+            <w:r>
+              <w:rPr>
+                <w:webHidden/>
+              </w:rPr>
+              <w:t>31</w:t>
+            </w:r>
+            <w:r>
+              <w:rPr>
+                <w:webHidden/>
+              </w:rPr>
+              <w:fldChar w:fldCharType="end"/>
+            </w:r>
+          </w:hyperlink>
+        </w:p>
+        <w:p>
+          <w:pPr>
+            <w:pStyle w:val="TOC1"/>
+            <w:rPr>
+              <w:rFonts w:asciiTheme="minorHAnsi" w:eastAsiaTheme="minorEastAsia" w:hAnsiTheme="minorHAnsi"/>
+              <w:kern w:val="2"/>
+              <w:lang w:val="en-KE" w:eastAsia="en-KE"/>
+              <w14:ligatures w14:val="standardContextual"/>
+            </w:rPr>
+          </w:pPr>
+          <w:hyperlink w:anchor="_Toc239855436" w:history="1">
+            <w:r>
+              <w:rPr>
+                <w:rStyle w:val="Hyperlink"/>
+              </w:rPr>
+              <w:t>16. Cost Analysis</w:t>
+            </w:r>
+            <w:r>
+              <w:rPr>
+                <w:webHidden/>
+              </w:rPr>
+              <w:tab/>
+            </w:r>
+            <w:r>
+              <w:rPr>
+                <w:webHidden/>
+              </w:rPr>
+              <w:fldChar w:fldCharType="begin"/>
+            </w:r>
+            <w:r>
+              <w:rPr>
+                <w:webHidden/>
+              </w:rPr>
+              <w:instrText xml:space="preserve"> PAGEREF _Toc239855436 \h </w:instrText>
+            </w:r>
+            <w:r>
+              <w:rPr>
+                <w:webHidden/>
+              </w:rPr>
+            </w:r>
+            <w:r>
+              <w:rPr>
+                <w:webHidden/>
+              </w:rPr>
+              <w:fldChar w:fldCharType="separate"/>
+            </w:r>
+            <w:r>
+              <w:rPr>
+                <w:webHidden/>
+              </w:rPr>
+              <w:t>32</w:t>
+            </w:r>
+            <w:r>
+              <w:rPr>
                 <w:webHidden/>
               </w:rPr>
               <w:fldChar w:fldCharType="end"/>
@@ -2722,14 +2665,14 @@
               <w14:ligatures w14:val="standardContextual"/>
             </w:rPr>
           </w:pPr>
-          <w:hyperlink w:anchor="_Toc239680025" w:history="1">
+          <w:hyperlink w:anchor="_Toc239855437" w:history="1">
             <w:r>
               <w:rPr>
                 <w:rStyle w:val="Hyperlink"/>
                 <w:rFonts w:ascii="Bierstadt Display" w:hAnsi="Bierstadt Display"/>
                 <w:noProof/>
               </w:rPr>
-              <w:t>16.2 Summary of cost analysis</w:t>
+              <w:t>16.1 Capital requirements</w:t>
             </w:r>
             <w:r>
               <w:rPr>
@@ -2750,7 +2693,7 @@
                 <w:noProof/>
                 <w:webHidden/>
               </w:rPr>
-              <w:instrText xml:space="preserve"> PAGEREF _Toc239680025 \h </w:instrText>
+              <w:instrText xml:space="preserve"> PAGEREF _Toc239855437 \h </w:instrText>
             </w:r>
             <w:r>
               <w:rPr>
@@ -2794,14 +2737,14 @@
               <w14:ligatures w14:val="standardContextual"/>
             </w:rPr>
           </w:pPr>
-          <w:hyperlink w:anchor="_Toc239680026" w:history="1">
+          <w:hyperlink w:anchor="_Toc239855438" w:history="1">
             <w:r>
               <w:rPr>
                 <w:rStyle w:val="Hyperlink"/>
                 <w:rFonts w:ascii="Bierstadt Display" w:hAnsi="Bierstadt Display"/>
                 <w:noProof/>
               </w:rPr>
-              <w:t>16.3 Assumptions</w:t>
+              <w:t>16.2 Summary of cost analysis</w:t>
             </w:r>
             <w:r>
               <w:rPr>
@@ -2822,7 +2765,7 @@
                 <w:noProof/>
                 <w:webHidden/>
               </w:rPr>
-              <w:instrText xml:space="preserve"> PAGEREF _Toc239680026 \h </w:instrText>
+              <w:instrText xml:space="preserve"> PAGEREF _Toc239855438 \h </w:instrText>
             </w:r>
             <w:r>
               <w:rPr>
@@ -2842,7 +2785,7 @@
                 <w:noProof/>
                 <w:webHidden/>
               </w:rPr>
-              <w:t>34</w:t>
+              <w:t>33</w:t>
             </w:r>
             <w:r>
               <w:rPr>
@@ -2866,14 +2809,14 @@
               <w14:ligatures w14:val="standardContextual"/>
             </w:rPr>
           </w:pPr>
-          <w:hyperlink w:anchor="_Toc239680027" w:history="1">
+          <w:hyperlink w:anchor="_Toc239855439" w:history="1">
             <w:r>
               <w:rPr>
                 <w:rStyle w:val="Hyperlink"/>
                 <w:rFonts w:ascii="Bierstadt Display" w:hAnsi="Bierstadt Display"/>
                 <w:noProof/>
               </w:rPr>
-              <w:t>16.4 Return on investment (ROI) analysis</w:t>
+              <w:t>16.3 Assumptions</w:t>
             </w:r>
             <w:r>
               <w:rPr>
@@ -2894,7 +2837,7 @@
                 <w:noProof/>
                 <w:webHidden/>
               </w:rPr>
-              <w:instrText xml:space="preserve"> PAGEREF _Toc239680027 \h </w:instrText>
+              <w:instrText xml:space="preserve"> PAGEREF _Toc239855439 \h </w:instrText>
             </w:r>
             <w:r>
               <w:rPr>
@@ -2914,7 +2857,7 @@
                 <w:noProof/>
                 <w:webHidden/>
               </w:rPr>
-              <w:t>35</w:t>
+              <w:t>34</w:t>
             </w:r>
             <w:r>
               <w:rPr>
@@ -2938,14 +2881,14 @@
               <w14:ligatures w14:val="standardContextual"/>
             </w:rPr>
           </w:pPr>
-          <w:hyperlink w:anchor="_Toc239680028" w:history="1">
+          <w:hyperlink w:anchor="_Toc239855440" w:history="1">
             <w:r>
               <w:rPr>
                 <w:rStyle w:val="Hyperlink"/>
                 <w:rFonts w:ascii="Bierstadt Display" w:hAnsi="Bierstadt Display"/>
                 <w:noProof/>
               </w:rPr>
-              <w:t>16.5 Risk and reward analysis</w:t>
+              <w:t>16.4 Return on investment (ROI) analysis</w:t>
             </w:r>
             <w:r>
               <w:rPr>
@@ -2966,7 +2909,7 @@
                 <w:noProof/>
                 <w:webHidden/>
               </w:rPr>
-              <w:instrText xml:space="preserve"> PAGEREF _Toc239680028 \h </w:instrText>
+              <w:instrText xml:space="preserve"> PAGEREF _Toc239855440 \h </w:instrText>
             </w:r>
             <w:r>
               <w:rPr>
@@ -3010,14 +2953,14 @@
               <w14:ligatures w14:val="standardContextual"/>
             </w:rPr>
           </w:pPr>
-          <w:hyperlink w:anchor="_Toc239680029" w:history="1">
+          <w:hyperlink w:anchor="_Toc239855441" w:history="1">
             <w:r>
               <w:rPr>
                 <w:rStyle w:val="Hyperlink"/>
                 <w:rFonts w:ascii="Bierstadt Display" w:hAnsi="Bierstadt Display"/>
                 <w:noProof/>
               </w:rPr>
-              <w:t>16.6 Scenario analysis</w:t>
+              <w:t>16.5 Risk and reward analysis</w:t>
             </w:r>
             <w:r>
               <w:rPr>
@@ -3038,7 +2981,7 @@
                 <w:noProof/>
                 <w:webHidden/>
               </w:rPr>
-              <w:instrText xml:space="preserve"> PAGEREF _Toc239680029 \h </w:instrText>
+              <w:instrText xml:space="preserve"> PAGEREF _Toc239855441 \h </w:instrText>
             </w:r>
             <w:r>
               <w:rPr>
@@ -3063,65 +3006,6 @@
             <w:r>
               <w:rPr>
                 <w:noProof/>
-                <w:webHidden/>
-              </w:rPr>
-              <w:fldChar w:fldCharType="end"/>
-            </w:r>
-          </w:hyperlink>
-        </w:p>
-        <w:p>
-          <w:pPr>
-            <w:pStyle w:val="TOC1"/>
-            <w:rPr>
-              <w:kern w:val="2"/>
-              <w:lang w:val="en-KE" w:eastAsia="en-KE"/>
-              <w14:ligatures w14:val="standardContextual"/>
-            </w:rPr>
-          </w:pPr>
-          <w:hyperlink w:anchor="_Toc239680030" w:history="1">
-            <w:r>
-              <w:rPr>
-                <w:rStyle w:val="Hyperlink"/>
-              </w:rPr>
-              <w:t>17. Recommendations</w:t>
-            </w:r>
-            <w:r>
-              <w:rPr>
-                <w:webHidden/>
-              </w:rPr>
-              <w:tab/>
-            </w:r>
-            <w:r>
-              <w:rPr>
-                <w:webHidden/>
-              </w:rPr>
-              <w:fldChar w:fldCharType="begin"/>
-            </w:r>
-            <w:r>
-              <w:rPr>
-                <w:webHidden/>
-              </w:rPr>
-              <w:instrText xml:space="preserve"> PAGEREF _Toc239680030 \h </w:instrText>
-            </w:r>
-            <w:r>
-              <w:rPr>
-                <w:webHidden/>
-              </w:rPr>
-            </w:r>
-            <w:r>
-              <w:rPr>
-                <w:webHidden/>
-              </w:rPr>
-              <w:fldChar w:fldCharType="separate"/>
-            </w:r>
-            <w:r>
-              <w:rPr>
-                <w:webHidden/>
-              </w:rPr>
-              <w:t>36</w:t>
-            </w:r>
-            <w:r>
-              <w:rPr>
                 <w:webHidden/>
               </w:rPr>
               <w:fldChar w:fldCharType="end"/>
@@ -3141,14 +3025,14 @@
               <w14:ligatures w14:val="standardContextual"/>
             </w:rPr>
           </w:pPr>
-          <w:hyperlink w:anchor="_Toc239680031" w:history="1">
+          <w:hyperlink w:anchor="_Toc239855442" w:history="1">
             <w:r>
               <w:rPr>
                 <w:rStyle w:val="Hyperlink"/>
                 <w:rFonts w:ascii="Bierstadt Display" w:hAnsi="Bierstadt Display"/>
                 <w:noProof/>
               </w:rPr>
-              <w:t>17.1 Prioritized recommendations (impact vs effort)</w:t>
+              <w:t>16.6 Scenario analysis</w:t>
             </w:r>
             <w:r>
               <w:rPr>
@@ -3169,7 +3053,7 @@
                 <w:noProof/>
                 <w:webHidden/>
               </w:rPr>
-              <w:instrText xml:space="preserve"> PAGEREF _Toc239680031 \h </w:instrText>
+              <w:instrText xml:space="preserve"> PAGEREF _Toc239855442 \h </w:instrText>
             </w:r>
             <w:r>
               <w:rPr>
@@ -3189,11 +3073,71 @@
                 <w:noProof/>
                 <w:webHidden/>
               </w:rPr>
+              <w:t>35</w:t>
+            </w:r>
+            <w:r>
+              <w:rPr>
+                <w:noProof/>
+                <w:webHidden/>
+              </w:rPr>
+              <w:fldChar w:fldCharType="end"/>
+            </w:r>
+          </w:hyperlink>
+        </w:p>
+        <w:p>
+          <w:pPr>
+            <w:pStyle w:val="TOC1"/>
+            <w:rPr>
+              <w:rFonts w:asciiTheme="minorHAnsi" w:eastAsiaTheme="minorEastAsia" w:hAnsiTheme="minorHAnsi"/>
+              <w:kern w:val="2"/>
+              <w:lang w:val="en-KE" w:eastAsia="en-KE"/>
+              <w14:ligatures w14:val="standardContextual"/>
+            </w:rPr>
+          </w:pPr>
+          <w:hyperlink w:anchor="_Toc239855443" w:history="1">
+            <w:r>
+              <w:rPr>
+                <w:rStyle w:val="Hyperlink"/>
+              </w:rPr>
+              <w:t>17. Recommendations</w:t>
+            </w:r>
+            <w:r>
+              <w:rPr>
+                <w:webHidden/>
+              </w:rPr>
+              <w:tab/>
+            </w:r>
+            <w:r>
+              <w:rPr>
+                <w:webHidden/>
+              </w:rPr>
+              <w:fldChar w:fldCharType="begin"/>
+            </w:r>
+            <w:r>
+              <w:rPr>
+                <w:webHidden/>
+              </w:rPr>
+              <w:instrText xml:space="preserve"> PAGEREF _Toc239855443 \h </w:instrText>
+            </w:r>
+            <w:r>
+              <w:rPr>
+                <w:webHidden/>
+              </w:rPr>
+            </w:r>
+            <w:r>
+              <w:rPr>
+                <w:webHidden/>
+              </w:rPr>
+              <w:fldChar w:fldCharType="separate"/>
+            </w:r>
+            <w:r>
+              <w:rPr>
+                <w:webHidden/>
+              </w:rPr>
               <w:t>36</w:t>
             </w:r>
             <w:r>
               <w:rPr>
-                <w:noProof/>
                 <w:webHidden/>
               </w:rPr>
               <w:fldChar w:fldCharType="end"/>
@@ -3213,14 +3157,14 @@
               <w14:ligatures w14:val="standardContextual"/>
             </w:rPr>
           </w:pPr>
-          <w:hyperlink w:anchor="_Toc239680032" w:history="1">
+          <w:hyperlink w:anchor="_Toc239855444" w:history="1">
             <w:r>
               <w:rPr>
                 <w:rStyle w:val="Hyperlink"/>
                 <w:rFonts w:ascii="Bierstadt Display" w:hAnsi="Bierstadt Display"/>
                 <w:noProof/>
               </w:rPr>
-              <w:t>17.2 Recommendation logic chains</w:t>
+              <w:t>17.1 Prioritized recommendations (impact vs effort)</w:t>
             </w:r>
             <w:r>
               <w:rPr>
@@ -3241,7 +3185,7 @@
                 <w:noProof/>
                 <w:webHidden/>
               </w:rPr>
-              <w:instrText xml:space="preserve"> PAGEREF _Toc239680032 \h </w:instrText>
+              <w:instrText xml:space="preserve"> PAGEREF _Toc239855444 \h </w:instrText>
             </w:r>
             <w:r>
               <w:rPr>
@@ -3261,7 +3205,7 @@
                 <w:noProof/>
                 <w:webHidden/>
               </w:rPr>
-              <w:t>37</w:t>
+              <w:t>36</w:t>
             </w:r>
             <w:r>
               <w:rPr>
@@ -3285,14 +3229,14 @@
               <w14:ligatures w14:val="standardContextual"/>
             </w:rPr>
           </w:pPr>
-          <w:hyperlink w:anchor="_Toc239680033" w:history="1">
+          <w:hyperlink w:anchor="_Toc239855445" w:history="1">
             <w:r>
               <w:rPr>
                 <w:rStyle w:val="Hyperlink"/>
                 <w:rFonts w:ascii="Bierstadt Display" w:hAnsi="Bierstadt Display"/>
                 <w:noProof/>
               </w:rPr>
-              <w:t>17.3 Roles and ownership (RACI-style: Responsible, Accountable, Consulted, Informed)</w:t>
+              <w:t>17.2 Recommendation logic chains</w:t>
             </w:r>
             <w:r>
               <w:rPr>
@@ -3313,7 +3257,7 @@
                 <w:noProof/>
                 <w:webHidden/>
               </w:rPr>
-              <w:instrText xml:space="preserve"> PAGEREF _Toc239680033 \h </w:instrText>
+              <w:instrText xml:space="preserve"> PAGEREF _Toc239855445 \h </w:instrText>
             </w:r>
             <w:r>
               <w:rPr>
@@ -3333,7 +3277,7 @@
                 <w:noProof/>
                 <w:webHidden/>
               </w:rPr>
-              <w:t>38</w:t>
+              <w:t>37</w:t>
             </w:r>
             <w:r>
               <w:rPr>
@@ -3357,14 +3301,14 @@
               <w14:ligatures w14:val="standardContextual"/>
             </w:rPr>
           </w:pPr>
-          <w:hyperlink w:anchor="_Toc239680034" w:history="1">
+          <w:hyperlink w:anchor="_Toc239855446" w:history="1">
             <w:r>
               <w:rPr>
                 <w:rStyle w:val="Hyperlink"/>
                 <w:rFonts w:ascii="Bierstadt Display" w:hAnsi="Bierstadt Display"/>
                 <w:noProof/>
               </w:rPr>
-              <w:t>17.4 Implementation phases</w:t>
+              <w:t>17.3 Roles and ownership (RACI-style: Responsible, Accountable, Consulted, Informed)</w:t>
             </w:r>
             <w:r>
               <w:rPr>
@@ -3385,7 +3329,7 @@
                 <w:noProof/>
                 <w:webHidden/>
               </w:rPr>
-              <w:instrText xml:space="preserve"> PAGEREF _Toc239680034 \h </w:instrText>
+              <w:instrText xml:space="preserve"> PAGEREF _Toc239855446 \h </w:instrText>
             </w:r>
             <w:r>
               <w:rPr>
@@ -3405,7 +3349,7 @@
                 <w:noProof/>
                 <w:webHidden/>
               </w:rPr>
-              <w:t>39</w:t>
+              <w:t>38</w:t>
             </w:r>
             <w:r>
               <w:rPr>
@@ -3429,14 +3373,14 @@
               <w14:ligatures w14:val="standardContextual"/>
             </w:rPr>
           </w:pPr>
-          <w:hyperlink w:anchor="_Toc239680035" w:history="1">
+          <w:hyperlink w:anchor="_Toc239855447" w:history="1">
             <w:r>
               <w:rPr>
                 <w:rStyle w:val="Hyperlink"/>
                 <w:rFonts w:ascii="Bierstadt Display" w:hAnsi="Bierstadt Display"/>
                 <w:noProof/>
               </w:rPr>
-              <w:t>17.5 Monitoring after deployment</w:t>
+              <w:t>17.4 Implementation phases</w:t>
             </w:r>
             <w:r>
               <w:rPr>
@@ -3457,7 +3401,7 @@
                 <w:noProof/>
                 <w:webHidden/>
               </w:rPr>
-              <w:instrText xml:space="preserve"> PAGEREF _Toc239680035 \h </w:instrText>
+              <w:instrText xml:space="preserve"> PAGEREF _Toc239855447 \h </w:instrText>
             </w:r>
             <w:r>
               <w:rPr>
@@ -3501,14 +3445,14 @@
               <w14:ligatures w14:val="standardContextual"/>
             </w:rPr>
           </w:pPr>
-          <w:hyperlink w:anchor="_Toc239680036" w:history="1">
+          <w:hyperlink w:anchor="_Toc239855448" w:history="1">
             <w:r>
               <w:rPr>
                 <w:rStyle w:val="Hyperlink"/>
                 <w:rFonts w:ascii="Bierstadt Display" w:hAnsi="Bierstadt Display"/>
                 <w:noProof/>
               </w:rPr>
-              <w:t>17.6 What would change our mind</w:t>
+              <w:t>17.5 Monitoring after deployment</w:t>
             </w:r>
             <w:r>
               <w:rPr>
@@ -3529,7 +3473,7 @@
                 <w:noProof/>
                 <w:webHidden/>
               </w:rPr>
-              <w:instrText xml:space="preserve"> PAGEREF _Toc239680036 \h </w:instrText>
+              <w:instrText xml:space="preserve"> PAGEREF _Toc239855448 \h </w:instrText>
             </w:r>
             <w:r>
               <w:rPr>
@@ -3549,7 +3493,7 @@
                 <w:noProof/>
                 <w:webHidden/>
               </w:rPr>
-              <w:t>40</w:t>
+              <w:t>39</w:t>
             </w:r>
             <w:r>
               <w:rPr>
@@ -3573,14 +3517,14 @@
               <w14:ligatures w14:val="standardContextual"/>
             </w:rPr>
           </w:pPr>
-          <w:hyperlink w:anchor="_Toc239680037" w:history="1">
+          <w:hyperlink w:anchor="_Toc239855449" w:history="1">
             <w:r>
               <w:rPr>
                 <w:rStyle w:val="Hyperlink"/>
                 <w:rFonts w:ascii="Bierstadt Display" w:hAnsi="Bierstadt Display"/>
                 <w:noProof/>
               </w:rPr>
-              <w:t>17.7 Investment Ask (Pilot Stage)</w:t>
+              <w:t>17.6 What would change our mind</w:t>
             </w:r>
             <w:r>
               <w:rPr>
@@ -3601,7 +3545,7 @@
                 <w:noProof/>
                 <w:webHidden/>
               </w:rPr>
-              <w:instrText xml:space="preserve"> PAGEREF _Toc239680037 \h </w:instrText>
+              <w:instrText xml:space="preserve"> PAGEREF _Toc239855449 \h </w:instrText>
             </w:r>
             <w:r>
               <w:rPr>
@@ -3645,14 +3589,14 @@
               <w14:ligatures w14:val="standardContextual"/>
             </w:rPr>
           </w:pPr>
-          <w:hyperlink w:anchor="_Toc239680038" w:history="1">
+          <w:hyperlink w:anchor="_Toc239855450" w:history="1">
             <w:r>
               <w:rPr>
                 <w:rStyle w:val="Hyperlink"/>
                 <w:rFonts w:ascii="Bierstadt Display" w:hAnsi="Bierstadt Display"/>
                 <w:noProof/>
               </w:rPr>
-              <w:t>17.8 Ambitious vision</w:t>
+              <w:t>17.7 Investment Ask (Pilot Stage)</w:t>
             </w:r>
             <w:r>
               <w:rPr>
@@ -3673,7 +3617,7 @@
                 <w:noProof/>
                 <w:webHidden/>
               </w:rPr>
-              <w:instrText xml:space="preserve"> PAGEREF _Toc239680038 \h </w:instrText>
+              <w:instrText xml:space="preserve"> PAGEREF _Toc239855450 \h </w:instrText>
             </w:r>
             <w:r>
               <w:rPr>
@@ -3693,70 +3637,11 @@
                 <w:noProof/>
                 <w:webHidden/>
               </w:rPr>
-              <w:t>41</w:t>
+              <w:t>40</w:t>
             </w:r>
             <w:r>
               <w:rPr>
                 <w:noProof/>
-                <w:webHidden/>
-              </w:rPr>
-              <w:fldChar w:fldCharType="end"/>
-            </w:r>
-          </w:hyperlink>
-        </w:p>
-        <w:p>
-          <w:pPr>
-            <w:pStyle w:val="TOC1"/>
-            <w:rPr>
-              <w:kern w:val="2"/>
-              <w:lang w:val="en-KE" w:eastAsia="en-KE"/>
-              <w14:ligatures w14:val="standardContextual"/>
-            </w:rPr>
-          </w:pPr>
-          <w:hyperlink w:anchor="_Toc239680039" w:history="1">
-            <w:r>
-              <w:rPr>
-                <w:rStyle w:val="Hyperlink"/>
-              </w:rPr>
-              <w:t>18. Reflective Statements</w:t>
-            </w:r>
-            <w:r>
-              <w:rPr>
-                <w:webHidden/>
-              </w:rPr>
-              <w:tab/>
-            </w:r>
-            <w:r>
-              <w:rPr>
-                <w:webHidden/>
-              </w:rPr>
-              <w:fldChar w:fldCharType="begin"/>
-            </w:r>
-            <w:r>
-              <w:rPr>
-                <w:webHidden/>
-              </w:rPr>
-              <w:instrText xml:space="preserve"> PAGEREF _Toc239680039 \h </w:instrText>
-            </w:r>
-            <w:r>
-              <w:rPr>
-                <w:webHidden/>
-              </w:rPr>
-            </w:r>
-            <w:r>
-              <w:rPr>
-                <w:webHidden/>
-              </w:rPr>
-              <w:fldChar w:fldCharType="separate"/>
-            </w:r>
-            <w:r>
-              <w:rPr>
-                <w:webHidden/>
-              </w:rPr>
-              <w:t>42</w:t>
-            </w:r>
-            <w:r>
-              <w:rPr>
                 <w:webHidden/>
               </w:rPr>
               <w:fldChar w:fldCharType="end"/>
@@ -3776,14 +3661,14 @@
               <w14:ligatures w14:val="standardContextual"/>
             </w:rPr>
           </w:pPr>
-          <w:hyperlink w:anchor="_Toc239680040" w:history="1">
+          <w:hyperlink w:anchor="_Toc239855451" w:history="1">
             <w:r>
               <w:rPr>
                 <w:rStyle w:val="Hyperlink"/>
-                <w:rFonts w:ascii="Bierstadt Display" w:eastAsia="Calibri" w:hAnsi="Bierstadt Display"/>
+                <w:rFonts w:ascii="Bierstadt Display" w:hAnsi="Bierstadt Display"/>
                 <w:noProof/>
               </w:rPr>
-              <w:t>18.1 Jesyldah Mwanyamba</w:t>
+              <w:t>17.8 Ambitious vision</w:t>
             </w:r>
             <w:r>
               <w:rPr>
@@ -3804,7 +3689,7 @@
                 <w:noProof/>
                 <w:webHidden/>
               </w:rPr>
-              <w:instrText xml:space="preserve"> PAGEREF _Toc239680040 \h </w:instrText>
+              <w:instrText xml:space="preserve"> PAGEREF _Toc239855451 \h </w:instrText>
             </w:r>
             <w:r>
               <w:rPr>
@@ -3824,11 +3709,71 @@
                 <w:noProof/>
                 <w:webHidden/>
               </w:rPr>
+              <w:t>41</w:t>
+            </w:r>
+            <w:r>
+              <w:rPr>
+                <w:noProof/>
+                <w:webHidden/>
+              </w:rPr>
+              <w:fldChar w:fldCharType="end"/>
+            </w:r>
+          </w:hyperlink>
+        </w:p>
+        <w:p>
+          <w:pPr>
+            <w:pStyle w:val="TOC1"/>
+            <w:rPr>
+              <w:rFonts w:asciiTheme="minorHAnsi" w:eastAsiaTheme="minorEastAsia" w:hAnsiTheme="minorHAnsi"/>
+              <w:kern w:val="2"/>
+              <w:lang w:val="en-KE" w:eastAsia="en-KE"/>
+              <w14:ligatures w14:val="standardContextual"/>
+            </w:rPr>
+          </w:pPr>
+          <w:hyperlink w:anchor="_Toc239855452" w:history="1">
+            <w:r>
+              <w:rPr>
+                <w:rStyle w:val="Hyperlink"/>
+              </w:rPr>
+              <w:t>18. Reflective Statements</w:t>
+            </w:r>
+            <w:r>
+              <w:rPr>
+                <w:webHidden/>
+              </w:rPr>
+              <w:tab/>
+            </w:r>
+            <w:r>
+              <w:rPr>
+                <w:webHidden/>
+              </w:rPr>
+              <w:fldChar w:fldCharType="begin"/>
+            </w:r>
+            <w:r>
+              <w:rPr>
+                <w:webHidden/>
+              </w:rPr>
+              <w:instrText xml:space="preserve"> PAGEREF _Toc239855452 \h </w:instrText>
+            </w:r>
+            <w:r>
+              <w:rPr>
+                <w:webHidden/>
+              </w:rPr>
+            </w:r>
+            <w:r>
+              <w:rPr>
+                <w:webHidden/>
+              </w:rPr>
+              <w:fldChar w:fldCharType="separate"/>
+            </w:r>
+            <w:r>
+              <w:rPr>
+                <w:webHidden/>
+              </w:rPr>
               <w:t>42</w:t>
             </w:r>
             <w:r>
               <w:rPr>
-                <w:noProof/>
                 <w:webHidden/>
               </w:rPr>
               <w:fldChar w:fldCharType="end"/>
@@ -3848,14 +3793,14 @@
               <w14:ligatures w14:val="standardContextual"/>
             </w:rPr>
           </w:pPr>
-          <w:hyperlink w:anchor="_Toc239680041" w:history="1">
+          <w:hyperlink w:anchor="_Toc239855453" w:history="1">
             <w:r>
               <w:rPr>
                 <w:rStyle w:val="Hyperlink"/>
                 <w:rFonts w:ascii="Bierstadt Display" w:eastAsia="Calibri" w:hAnsi="Bierstadt Display"/>
                 <w:noProof/>
               </w:rPr>
-              <w:t>18.2 Dorine Okello (draft for her edit)</w:t>
+              <w:t>18.1 Jesyldah Mwanyamba</w:t>
             </w:r>
             <w:r>
               <w:rPr>
@@ -3876,7 +3821,7 @@
                 <w:noProof/>
                 <w:webHidden/>
               </w:rPr>
-              <w:instrText xml:space="preserve"> PAGEREF _Toc239680041 \h </w:instrText>
+              <w:instrText xml:space="preserve"> PAGEREF _Toc239855453 \h </w:instrText>
             </w:r>
             <w:r>
               <w:rPr>
@@ -3896,129 +3841,11 @@
                 <w:noProof/>
                 <w:webHidden/>
               </w:rPr>
-              <w:t>43</w:t>
+              <w:t>42</w:t>
             </w:r>
             <w:r>
               <w:rPr>
                 <w:noProof/>
-                <w:webHidden/>
-              </w:rPr>
-              <w:fldChar w:fldCharType="end"/>
-            </w:r>
-          </w:hyperlink>
-        </w:p>
-        <w:p>
-          <w:pPr>
-            <w:pStyle w:val="TOC1"/>
-            <w:rPr>
-              <w:kern w:val="2"/>
-              <w:lang w:val="en-KE" w:eastAsia="en-KE"/>
-              <w14:ligatures w14:val="standardContextual"/>
-            </w:rPr>
-          </w:pPr>
-          <w:hyperlink w:anchor="_Toc239680042" w:history="1">
-            <w:r>
-              <w:rPr>
-                <w:rStyle w:val="Hyperlink"/>
-              </w:rPr>
-              <w:t>19. References</w:t>
-            </w:r>
-            <w:r>
-              <w:rPr>
-                <w:webHidden/>
-              </w:rPr>
-              <w:tab/>
-            </w:r>
-            <w:r>
-              <w:rPr>
-                <w:webHidden/>
-              </w:rPr>
-              <w:fldChar w:fldCharType="begin"/>
-            </w:r>
-            <w:r>
-              <w:rPr>
-                <w:webHidden/>
-              </w:rPr>
-              <w:instrText xml:space="preserve"> PAGEREF _Toc239680042 \h </w:instrText>
-            </w:r>
-            <w:r>
-              <w:rPr>
-                <w:webHidden/>
-              </w:rPr>
-            </w:r>
-            <w:r>
-              <w:rPr>
-                <w:webHidden/>
-              </w:rPr>
-              <w:fldChar w:fldCharType="separate"/>
-            </w:r>
-            <w:r>
-              <w:rPr>
-                <w:webHidden/>
-              </w:rPr>
-              <w:t>44</w:t>
-            </w:r>
-            <w:r>
-              <w:rPr>
-                <w:webHidden/>
-              </w:rPr>
-              <w:fldChar w:fldCharType="end"/>
-            </w:r>
-          </w:hyperlink>
-        </w:p>
-        <w:p>
-          <w:pPr>
-            <w:pStyle w:val="TOC1"/>
-            <w:rPr>
-              <w:kern w:val="2"/>
-              <w:lang w:val="en-KE" w:eastAsia="en-KE"/>
-              <w14:ligatures w14:val="standardContextual"/>
-            </w:rPr>
-          </w:pPr>
-          <w:hyperlink w:anchor="_Toc239680043" w:history="1">
-            <w:r>
-              <w:rPr>
-                <w:rStyle w:val="Hyperlink"/>
-              </w:rPr>
-              <w:t>20. Appendix</w:t>
-            </w:r>
-            <w:r>
-              <w:rPr>
-                <w:webHidden/>
-              </w:rPr>
-              <w:tab/>
-            </w:r>
-            <w:r>
-              <w:rPr>
-                <w:webHidden/>
-              </w:rPr>
-              <w:fldChar w:fldCharType="begin"/>
-            </w:r>
-            <w:r>
-              <w:rPr>
-                <w:webHidden/>
-              </w:rPr>
-              <w:instrText xml:space="preserve"> PAGEREF _Toc239680043 \h </w:instrText>
-            </w:r>
-            <w:r>
-              <w:rPr>
-                <w:webHidden/>
-              </w:rPr>
-            </w:r>
-            <w:r>
-              <w:rPr>
-                <w:webHidden/>
-              </w:rPr>
-              <w:fldChar w:fldCharType="separate"/>
-            </w:r>
-            <w:r>
-              <w:rPr>
-                <w:webHidden/>
-              </w:rPr>
-              <w:t>47</w:t>
-            </w:r>
-            <w:r>
-              <w:rPr>
                 <w:webHidden/>
               </w:rPr>
               <w:fldChar w:fldCharType="end"/>
@@ -4038,14 +3865,14 @@
               <w14:ligatures w14:val="standardContextual"/>
             </w:rPr>
           </w:pPr>
-          <w:hyperlink w:anchor="_Toc239680044" w:history="1">
+          <w:hyperlink w:anchor="_Toc239855454" w:history="1">
             <w:r>
               <w:rPr>
                 <w:rStyle w:val="Hyperlink"/>
-                <w:rFonts w:ascii="Bierstadt Display" w:hAnsi="Bierstadt Display"/>
+                <w:rFonts w:ascii="Bierstadt Display" w:eastAsia="Calibri" w:hAnsi="Bierstadt Display"/>
                 <w:noProof/>
               </w:rPr>
-              <w:t>A. Glossary</w:t>
+              <w:t>18.2 Dorine Okello (draft for her edit)</w:t>
             </w:r>
             <w:r>
               <w:rPr>
@@ -4066,7 +3893,7 @@
                 <w:noProof/>
                 <w:webHidden/>
               </w:rPr>
-              <w:instrText xml:space="preserve"> PAGEREF _Toc239680044 \h </w:instrText>
+              <w:instrText xml:space="preserve"> PAGEREF _Toc239855454 \h </w:instrText>
             </w:r>
             <w:r>
               <w:rPr>
@@ -4086,11 +3913,131 @@
                 <w:noProof/>
                 <w:webHidden/>
               </w:rPr>
+              <w:t>43</w:t>
+            </w:r>
+            <w:r>
+              <w:rPr>
+                <w:noProof/>
+                <w:webHidden/>
+              </w:rPr>
+              <w:fldChar w:fldCharType="end"/>
+            </w:r>
+          </w:hyperlink>
+        </w:p>
+        <w:p>
+          <w:pPr>
+            <w:pStyle w:val="TOC1"/>
+            <w:rPr>
+              <w:rFonts w:asciiTheme="minorHAnsi" w:eastAsiaTheme="minorEastAsia" w:hAnsiTheme="minorHAnsi"/>
+              <w:kern w:val="2"/>
+              <w:lang w:val="en-KE" w:eastAsia="en-KE"/>
+              <w14:ligatures w14:val="standardContextual"/>
+            </w:rPr>
+          </w:pPr>
+          <w:hyperlink w:anchor="_Toc239855455" w:history="1">
+            <w:r>
+              <w:rPr>
+                <w:rStyle w:val="Hyperlink"/>
+              </w:rPr>
+              <w:t>19. References</w:t>
+            </w:r>
+            <w:r>
+              <w:rPr>
+                <w:webHidden/>
+              </w:rPr>
+              <w:tab/>
+            </w:r>
+            <w:r>
+              <w:rPr>
+                <w:webHidden/>
+              </w:rPr>
+              <w:fldChar w:fldCharType="begin"/>
+            </w:r>
+            <w:r>
+              <w:rPr>
+                <w:webHidden/>
+              </w:rPr>
+              <w:instrText xml:space="preserve"> PAGEREF _Toc239855455 \h </w:instrText>
+            </w:r>
+            <w:r>
+              <w:rPr>
+                <w:webHidden/>
+              </w:rPr>
+            </w:r>
+            <w:r>
+              <w:rPr>
+                <w:webHidden/>
+              </w:rPr>
+              <w:fldChar w:fldCharType="separate"/>
+            </w:r>
+            <w:r>
+              <w:rPr>
+                <w:webHidden/>
+              </w:rPr>
+              <w:t>44</w:t>
+            </w:r>
+            <w:r>
+              <w:rPr>
+                <w:webHidden/>
+              </w:rPr>
+              <w:fldChar w:fldCharType="end"/>
+            </w:r>
+          </w:hyperlink>
+        </w:p>
+        <w:p>
+          <w:pPr>
+            <w:pStyle w:val="TOC1"/>
+            <w:rPr>
+              <w:rFonts w:asciiTheme="minorHAnsi" w:eastAsiaTheme="minorEastAsia" w:hAnsiTheme="minorHAnsi"/>
+              <w:kern w:val="2"/>
+              <w:lang w:val="en-KE" w:eastAsia="en-KE"/>
+              <w14:ligatures w14:val="standardContextual"/>
+            </w:rPr>
+          </w:pPr>
+          <w:hyperlink w:anchor="_Toc239855456" w:history="1">
+            <w:r>
+              <w:rPr>
+                <w:rStyle w:val="Hyperlink"/>
+              </w:rPr>
+              <w:t>20. Appendix</w:t>
+            </w:r>
+            <w:r>
+              <w:rPr>
+                <w:webHidden/>
+              </w:rPr>
+              <w:tab/>
+            </w:r>
+            <w:r>
+              <w:rPr>
+                <w:webHidden/>
+              </w:rPr>
+              <w:fldChar w:fldCharType="begin"/>
+            </w:r>
+            <w:r>
+              <w:rPr>
+                <w:webHidden/>
+              </w:rPr>
+              <w:instrText xml:space="preserve"> PAGEREF _Toc239855456 \h </w:instrText>
+            </w:r>
+            <w:r>
+              <w:rPr>
+                <w:webHidden/>
+              </w:rPr>
+            </w:r>
+            <w:r>
+              <w:rPr>
+                <w:webHidden/>
+              </w:rPr>
+              <w:fldChar w:fldCharType="separate"/>
+            </w:r>
+            <w:r>
+              <w:rPr>
+                <w:webHidden/>
+              </w:rPr>
               <w:t>47</w:t>
             </w:r>
             <w:r>
               <w:rPr>
-                <w:noProof/>
                 <w:webHidden/>
               </w:rPr>
               <w:fldChar w:fldCharType="end"/>
@@ -4110,14 +4057,14 @@
               <w14:ligatures w14:val="standardContextual"/>
             </w:rPr>
           </w:pPr>
-          <w:hyperlink w:anchor="_Toc239680045" w:history="1">
+          <w:hyperlink w:anchor="_Toc239855457" w:history="1">
             <w:r>
               <w:rPr>
                 <w:rStyle w:val="Hyperlink"/>
-                <w:rFonts w:ascii="Bierstadt Display" w:eastAsia="Calibri" w:hAnsi="Bierstadt Display"/>
+                <w:rFonts w:ascii="Bierstadt Display" w:hAnsi="Bierstadt Display"/>
                 <w:noProof/>
               </w:rPr>
-              <w:t>B. Key links and internal documents</w:t>
+              <w:t>A. Glossary</w:t>
             </w:r>
             <w:r>
               <w:rPr>
@@ -4138,7 +4085,7 @@
                 <w:noProof/>
                 <w:webHidden/>
               </w:rPr>
-              <w:instrText xml:space="preserve"> PAGEREF _Toc239680045 \h </w:instrText>
+              <w:instrText xml:space="preserve"> PAGEREF _Toc239855457 \h </w:instrText>
             </w:r>
             <w:r>
               <w:rPr>
@@ -4182,14 +4129,14 @@
               <w14:ligatures w14:val="standardContextual"/>
             </w:rPr>
           </w:pPr>
-          <w:hyperlink w:anchor="_Toc239680046" w:history="1">
+          <w:hyperlink w:anchor="_Toc239855458" w:history="1">
             <w:r>
               <w:rPr>
                 <w:rStyle w:val="Hyperlink"/>
                 <w:rFonts w:ascii="Bierstadt Display" w:eastAsia="Calibri" w:hAnsi="Bierstadt Display"/>
                 <w:noProof/>
               </w:rPr>
-              <w:t>C. Figure index (report narrative)</w:t>
+              <w:t>B. Key links and internal documents</w:t>
             </w:r>
             <w:r>
               <w:rPr>
@@ -4210,7 +4157,7 @@
                 <w:noProof/>
                 <w:webHidden/>
               </w:rPr>
-              <w:instrText xml:space="preserve"> PAGEREF _Toc239680046 \h </w:instrText>
+              <w:instrText xml:space="preserve"> PAGEREF _Toc239855458 \h </w:instrText>
             </w:r>
             <w:r>
               <w:rPr>
@@ -4254,14 +4201,14 @@
               <w14:ligatures w14:val="standardContextual"/>
             </w:rPr>
           </w:pPr>
-          <w:hyperlink w:anchor="_Toc239680047" w:history="1">
+          <w:hyperlink w:anchor="_Toc239855459" w:history="1">
             <w:r>
               <w:rPr>
                 <w:rStyle w:val="Hyperlink"/>
                 <w:rFonts w:ascii="Bierstadt Display" w:eastAsia="Calibri" w:hAnsi="Bierstadt Display"/>
                 <w:noProof/>
               </w:rPr>
-              <w:t>D. Predictive feature families and dictionary snapshot</w:t>
+              <w:t>C. Figure index (report narrative)</w:t>
             </w:r>
             <w:r>
               <w:rPr>
@@ -4282,7 +4229,7 @@
                 <w:noProof/>
                 <w:webHidden/>
               </w:rPr>
-              <w:instrText xml:space="preserve"> PAGEREF _Toc239680047 \h </w:instrText>
+              <w:instrText xml:space="preserve"> PAGEREF _Toc239855459 \h </w:instrText>
             </w:r>
             <w:r>
               <w:rPr>
@@ -4326,14 +4273,14 @@
               <w14:ligatures w14:val="standardContextual"/>
             </w:rPr>
           </w:pPr>
-          <w:hyperlink w:anchor="_Toc239680048" w:history="1">
+          <w:hyperlink w:anchor="_Toc239855460" w:history="1">
             <w:r>
               <w:rPr>
                 <w:rStyle w:val="Hyperlink"/>
                 <w:rFonts w:ascii="Bierstadt Display" w:eastAsia="Calibri" w:hAnsi="Bierstadt Display"/>
                 <w:noProof/>
               </w:rPr>
-              <w:t>E. Modeling snapshot</w:t>
+              <w:t>D. Predictive feature families and dictionary snapshot</w:t>
             </w:r>
             <w:r>
               <w:rPr>
@@ -4354,7 +4301,7 @@
                 <w:noProof/>
                 <w:webHidden/>
               </w:rPr>
-              <w:instrText xml:space="preserve"> PAGEREF _Toc239680048 \h </w:instrText>
+              <w:instrText xml:space="preserve"> PAGEREF _Toc239855460 \h </w:instrText>
             </w:r>
             <w:r>
               <w:rPr>
@@ -4398,14 +4345,14 @@
               <w14:ligatures w14:val="standardContextual"/>
             </w:rPr>
           </w:pPr>
-          <w:hyperlink w:anchor="_Toc239680049" w:history="1">
+          <w:hyperlink w:anchor="_Toc239855461" w:history="1">
             <w:r>
               <w:rPr>
                 <w:rStyle w:val="Hyperlink"/>
                 <w:rFonts w:ascii="Bierstadt Display" w:eastAsia="Calibri" w:hAnsi="Bierstadt Display"/>
                 <w:noProof/>
               </w:rPr>
-              <w:t>F. Cost-benefit snapshot</w:t>
+              <w:t>E. Modeling snapshot</w:t>
             </w:r>
             <w:r>
               <w:rPr>
@@ -4426,7 +4373,7 @@
                 <w:noProof/>
                 <w:webHidden/>
               </w:rPr>
-              <w:instrText xml:space="preserve"> PAGEREF _Toc239680049 \h </w:instrText>
+              <w:instrText xml:space="preserve"> PAGEREF _Toc239855461 \h </w:instrText>
             </w:r>
             <w:r>
               <w:rPr>
@@ -4470,14 +4417,14 @@
               <w14:ligatures w14:val="standardContextual"/>
             </w:rPr>
           </w:pPr>
-          <w:hyperlink w:anchor="_Toc239680050" w:history="1">
+          <w:hyperlink w:anchor="_Toc239855462" w:history="1">
             <w:r>
               <w:rPr>
                 <w:rStyle w:val="Hyperlink"/>
                 <w:rFonts w:ascii="Bierstadt Display" w:eastAsia="Calibri" w:hAnsi="Bierstadt Display"/>
                 <w:noProof/>
               </w:rPr>
-              <w:t>G. Reproduction note</w:t>
+              <w:t>F. Cost-benefit snapshot</w:t>
             </w:r>
             <w:r>
               <w:rPr>
@@ -4498,7 +4445,7 @@
                 <w:noProof/>
                 <w:webHidden/>
               </w:rPr>
-              <w:instrText xml:space="preserve"> PAGEREF _Toc239680050 \h </w:instrText>
+              <w:instrText xml:space="preserve"> PAGEREF _Toc239855462 \h </w:instrText>
             </w:r>
             <w:r>
               <w:rPr>
@@ -4542,14 +4489,14 @@
               <w14:ligatures w14:val="standardContextual"/>
             </w:rPr>
           </w:pPr>
-          <w:hyperlink w:anchor="_Toc239680051" w:history="1">
+          <w:hyperlink w:anchor="_Toc239855463" w:history="1">
             <w:r>
               <w:rPr>
                 <w:rStyle w:val="Hyperlink"/>
                 <w:rFonts w:ascii="Bierstadt Display" w:eastAsia="Calibri" w:hAnsi="Bierstadt Display"/>
                 <w:noProof/>
               </w:rPr>
-              <w:t>H. Decision log (significant choices)</w:t>
+              <w:t>G. Reproduction note</w:t>
             </w:r>
             <w:r>
               <w:rPr>
@@ -4570,7 +4517,7 @@
                 <w:noProof/>
                 <w:webHidden/>
               </w:rPr>
-              <w:instrText xml:space="preserve"> PAGEREF _Toc239680051 \h </w:instrText>
+              <w:instrText xml:space="preserve"> PAGEREF _Toc239855463 \h </w:instrText>
             </w:r>
             <w:r>
               <w:rPr>
@@ -4614,14 +4561,14 @@
               <w14:ligatures w14:val="standardContextual"/>
             </w:rPr>
           </w:pPr>
-          <w:hyperlink w:anchor="_Toc239680052" w:history="1">
+          <w:hyperlink w:anchor="_Toc239855464" w:history="1">
             <w:r>
               <w:rPr>
                 <w:rStyle w:val="Hyperlink"/>
                 <w:rFonts w:ascii="Bierstadt Display" w:eastAsia="Calibri" w:hAnsi="Bierstadt Display"/>
                 <w:noProof/>
               </w:rPr>
-              <w:t>I. Figures and sources note</w:t>
+              <w:t>H. Decision log (significant choices)</w:t>
             </w:r>
             <w:r>
               <w:rPr>
@@ -4642,7 +4589,79 @@
                 <w:noProof/>
                 <w:webHidden/>
               </w:rPr>
-              <w:instrText xml:space="preserve"> PAGEREF _Toc239680052 \h </w:instrText>
+              <w:instrText xml:space="preserve"> PAGEREF _Toc239855464 \h </w:instrText>
+            </w:r>
+            <w:r>
+              <w:rPr>
+                <w:noProof/>
+                <w:webHidden/>
+              </w:rPr>
+            </w:r>
+            <w:r>
+              <w:rPr>
+                <w:noProof/>
+                <w:webHidden/>
+              </w:rPr>
+              <w:fldChar w:fldCharType="separate"/>
+            </w:r>
+            <w:r>
+              <w:rPr>
+                <w:noProof/>
+                <w:webHidden/>
+              </w:rPr>
+              <w:t>49</w:t>
+            </w:r>
+            <w:r>
+              <w:rPr>
+                <w:noProof/>
+                <w:webHidden/>
+              </w:rPr>
+              <w:fldChar w:fldCharType="end"/>
+            </w:r>
+          </w:hyperlink>
+        </w:p>
+        <w:p>
+          <w:pPr>
+            <w:pStyle w:val="TOC2"/>
+            <w:tabs>
+              <w:tab w:val="right" w:leader="dot" w:pos="9350"/>
+            </w:tabs>
+            <w:rPr>
+              <w:noProof/>
+              <w:kern w:val="2"/>
+              <w:lang w:val="en-KE" w:eastAsia="en-KE"/>
+              <w14:ligatures w14:val="standardContextual"/>
+            </w:rPr>
+          </w:pPr>
+          <w:hyperlink w:anchor="_Toc239855465" w:history="1">
+            <w:r>
+              <w:rPr>
+                <w:rStyle w:val="Hyperlink"/>
+                <w:rFonts w:ascii="Bierstadt Display" w:eastAsia="Calibri" w:hAnsi="Bierstadt Display"/>
+                <w:noProof/>
+              </w:rPr>
+              <w:t>I. Figures and sources note</w:t>
+            </w:r>
+            <w:r>
+              <w:rPr>
+                <w:noProof/>
+                <w:webHidden/>
+              </w:rPr>
+              <w:tab/>
+            </w:r>
+            <w:r>
+              <w:rPr>
+                <w:noProof/>
+                <w:webHidden/>
+              </w:rPr>
+              <w:fldChar w:fldCharType="begin"/>
+            </w:r>
+            <w:r>
+              <w:rPr>
+                <w:noProof/>
+                <w:webHidden/>
+              </w:rPr>
+              <w:instrText xml:space="preserve"> PAGEREF _Toc239855465 \h </w:instrText>
             </w:r>
             <w:r>
               <w:rPr>
@@ -4720,7 +4739,7 @@
           <w:szCs w:val="26"/>
         </w:rPr>
       </w:pPr>
-      <w:bookmarkStart w:id="0" w:name="_Toc239679990"/>
+      <w:bookmarkStart w:id="0" w:name="_Toc239855403"/>
       <w:r>
         <w:rPr>
           <w:rFonts w:ascii="Bierstadt Display" w:eastAsia="Calibri" w:hAnsi="Bierstadt Display"/>
@@ -5422,7 +5441,7 @@
           <w:szCs w:val="26"/>
         </w:rPr>
       </w:pPr>
-      <w:bookmarkStart w:id="1" w:name="_Toc239679991"/>
+      <w:bookmarkStart w:id="1" w:name="_Toc239855404"/>
       <w:r>
         <w:rPr>
           <w:rFonts w:ascii="Bierstadt Display" w:eastAsia="Calibri" w:hAnsi="Bierstadt Display"/>
@@ -5940,7 +5959,7 @@
           <w:szCs w:val="26"/>
         </w:rPr>
       </w:pPr>
-      <w:bookmarkStart w:id="2" w:name="_Toc239679992"/>
+      <w:bookmarkStart w:id="2" w:name="_Toc239855405"/>
       <w:r>
         <w:rPr>
           <w:rFonts w:ascii="Bierstadt Display" w:eastAsia="Calibri" w:hAnsi="Bierstadt Display"/>
@@ -6251,7 +6270,7 @@
           <w:szCs w:val="26"/>
         </w:rPr>
       </w:pPr>
-      <w:bookmarkStart w:id="3" w:name="_Toc239679993"/>
+      <w:bookmarkStart w:id="3" w:name="_Toc239855406"/>
       <w:r>
         <w:rPr>
           <w:rFonts w:ascii="Bierstadt Display" w:eastAsia="Calibri" w:hAnsi="Bierstadt Display"/>
@@ -6274,7 +6293,7 @@
           <w:szCs w:val="22"/>
         </w:rPr>
       </w:pPr>
-      <w:bookmarkStart w:id="4" w:name="_Toc239679994"/>
+      <w:bookmarkStart w:id="4" w:name="_Toc239855407"/>
       <w:r>
         <w:rPr>
           <w:rFonts w:ascii="Bierstadt Display" w:eastAsia="Calibri" w:hAnsi="Bierstadt Display"/>
@@ -6363,7 +6382,7 @@
           <w:szCs w:val="22"/>
         </w:rPr>
       </w:pPr>
-      <w:bookmarkStart w:id="5" w:name="_Toc239679995"/>
+      <w:bookmarkStart w:id="5" w:name="_Toc239855408"/>
       <w:r>
         <w:rPr>
           <w:rFonts w:ascii="Bierstadt Display" w:eastAsia="Calibri" w:hAnsi="Bierstadt Display"/>
@@ -6751,7 +6770,7 @@
           <w:szCs w:val="22"/>
         </w:rPr>
       </w:pPr>
-      <w:bookmarkStart w:id="6" w:name="_Toc239679996"/>
+      <w:bookmarkStart w:id="6" w:name="_Toc239855409"/>
       <w:r>
         <w:rPr>
           <w:rFonts w:ascii="Bierstadt Display" w:eastAsia="Calibri" w:hAnsi="Bierstadt Display"/>
@@ -7557,7 +7576,7 @@
           <w:szCs w:val="22"/>
         </w:rPr>
       </w:pPr>
-      <w:bookmarkStart w:id="7" w:name="_Toc239679997"/>
+      <w:bookmarkStart w:id="7" w:name="_Toc239855410"/>
       <w:r>
         <w:rPr>
           <w:rFonts w:ascii="Bierstadt Display" w:eastAsia="Calibri" w:hAnsi="Bierstadt Display"/>
@@ -7610,7 +7629,7 @@
           <w:szCs w:val="26"/>
         </w:rPr>
       </w:pPr>
-      <w:bookmarkStart w:id="8" w:name="_Toc239679998"/>
+      <w:bookmarkStart w:id="8" w:name="_Toc239855411"/>
       <w:r>
         <w:rPr>
           <w:rFonts w:ascii="Bierstadt Display" w:eastAsia="Calibri" w:hAnsi="Bierstadt Display"/>
@@ -7662,7 +7681,7 @@
           <w:szCs w:val="22"/>
         </w:rPr>
       </w:pPr>
-      <w:bookmarkStart w:id="9" w:name="_Toc239679999"/>
+      <w:bookmarkStart w:id="9" w:name="_Toc239855412"/>
       <w:r>
         <w:rPr>
           <w:rFonts w:ascii="Bierstadt Display" w:eastAsia="Calibri" w:hAnsi="Bierstadt Display"/>
@@ -7790,7 +7809,7 @@
           <w:szCs w:val="22"/>
         </w:rPr>
       </w:pPr>
-      <w:bookmarkStart w:id="10" w:name="_Toc239680000"/>
+      <w:bookmarkStart w:id="10" w:name="_Toc239855413"/>
       <w:r>
         <w:rPr>
           <w:rFonts w:ascii="Bierstadt Display" w:eastAsia="Calibri" w:hAnsi="Bierstadt Display"/>
@@ -8072,7 +8091,7 @@
           <w:szCs w:val="26"/>
         </w:rPr>
       </w:pPr>
-      <w:bookmarkStart w:id="11" w:name="_Toc239680001"/>
+      <w:bookmarkStart w:id="11" w:name="_Toc239855414"/>
       <w:r>
         <w:rPr>
           <w:rFonts w:ascii="Bierstadt Display" w:eastAsia="Calibri" w:hAnsi="Bierstadt Display"/>
@@ -8308,7 +8327,7 @@
           <w:szCs w:val="26"/>
         </w:rPr>
       </w:pPr>
-      <w:bookmarkStart w:id="12" w:name="_Toc239680002"/>
+      <w:bookmarkStart w:id="12" w:name="_Toc239855415"/>
       <w:r>
         <w:rPr>
           <w:rFonts w:ascii="Bierstadt Display" w:eastAsia="Calibri" w:hAnsi="Bierstadt Display"/>
@@ -8379,7 +8398,7 @@
           <w:szCs w:val="26"/>
         </w:rPr>
       </w:pPr>
-      <w:bookmarkStart w:id="13" w:name="_Toc239680003"/>
+      <w:bookmarkStart w:id="13" w:name="_Toc239855416"/>
       <w:r>
         <w:rPr>
           <w:rFonts w:ascii="Bierstadt Display" w:eastAsia="Calibri" w:hAnsi="Bierstadt Display"/>
@@ -8443,7 +8462,7 @@
           <w:szCs w:val="22"/>
         </w:rPr>
       </w:pPr>
-      <w:bookmarkStart w:id="14" w:name="_Toc239680004"/>
+      <w:bookmarkStart w:id="14" w:name="_Toc239855417"/>
       <w:r>
         <w:rPr>
           <w:rFonts w:ascii="Bierstadt Display" w:hAnsi="Bierstadt Display"/>
@@ -9702,7 +9721,7 @@
           <w:szCs w:val="22"/>
         </w:rPr>
       </w:pPr>
-      <w:bookmarkStart w:id="15" w:name="_Toc239680005"/>
+      <w:bookmarkStart w:id="15" w:name="_Toc239855418"/>
       <w:r>
         <w:rPr>
           <w:rFonts w:ascii="Bierstadt Display" w:hAnsi="Bierstadt Display"/>
@@ -10646,7 +10665,7 @@
           <w:szCs w:val="26"/>
         </w:rPr>
       </w:pPr>
-      <w:bookmarkStart w:id="16" w:name="_Toc239680006"/>
+      <w:bookmarkStart w:id="16" w:name="_Toc239855419"/>
       <w:r>
         <w:rPr>
           <w:rFonts w:ascii="Bierstadt Display" w:eastAsia="Calibri" w:hAnsi="Bierstadt Display"/>
@@ -12356,7 +12375,7 @@
           <w:szCs w:val="26"/>
         </w:rPr>
       </w:pPr>
-      <w:bookmarkStart w:id="17" w:name="_Toc239680007"/>
+      <w:bookmarkStart w:id="17" w:name="_Toc239855420"/>
       <w:r>
         <w:rPr>
           <w:rFonts w:ascii="Bierstadt Display" w:eastAsia="Calibri" w:hAnsi="Bierstadt Display"/>
@@ -12378,7 +12397,7 @@
           <w:szCs w:val="22"/>
         </w:rPr>
       </w:pPr>
-      <w:bookmarkStart w:id="18" w:name="_Toc239680008"/>
+      <w:bookmarkStart w:id="18" w:name="_Toc239855421"/>
       <w:r>
         <w:rPr>
           <w:rFonts w:ascii="Bierstadt Display" w:hAnsi="Bierstadt Display"/>
@@ -12435,7 +12454,7 @@
           <w:szCs w:val="22"/>
         </w:rPr>
       </w:pPr>
-      <w:bookmarkStart w:id="19" w:name="_Toc239680009"/>
+      <w:bookmarkStart w:id="19" w:name="_Toc239855422"/>
       <w:r>
         <w:rPr>
           <w:rFonts w:ascii="Bierstadt Display" w:hAnsi="Bierstadt Display"/>
@@ -12472,7 +12491,7 @@
           <w:szCs w:val="22"/>
         </w:rPr>
       </w:pPr>
-      <w:bookmarkStart w:id="20" w:name="_Toc239680010"/>
+      <w:bookmarkStart w:id="20" w:name="_Toc239855423"/>
       <w:r>
         <w:rPr>
           <w:rFonts w:ascii="Bierstadt Display" w:hAnsi="Bierstadt Display"/>
@@ -13633,7 +13652,7 @@
           <w:szCs w:val="26"/>
         </w:rPr>
       </w:pPr>
-      <w:bookmarkStart w:id="21" w:name="_Toc239680011"/>
+      <w:bookmarkStart w:id="21" w:name="_Toc239855424"/>
       <w:r>
         <w:rPr>
           <w:rFonts w:ascii="Bierstadt Display" w:eastAsia="Calibri" w:hAnsi="Bierstadt Display"/>
@@ -13685,7 +13704,7 @@
           <w:szCs w:val="22"/>
         </w:rPr>
       </w:pPr>
-      <w:bookmarkStart w:id="22" w:name="_Toc239680012"/>
+      <w:bookmarkStart w:id="22" w:name="_Toc239855425"/>
       <w:r>
         <w:rPr>
           <w:rFonts w:ascii="Bierstadt Display" w:eastAsia="Calibri" w:hAnsi="Bierstadt Display"/>
@@ -14330,7 +14349,7 @@
           <w:szCs w:val="22"/>
         </w:rPr>
       </w:pPr>
-      <w:bookmarkStart w:id="23" w:name="_Toc239680013"/>
+      <w:bookmarkStart w:id="23" w:name="_Toc239855426"/>
       <w:r>
         <w:rPr>
           <w:rFonts w:ascii="Bierstadt Display" w:eastAsia="Calibri" w:hAnsi="Bierstadt Display"/>
@@ -16071,7 +16090,7 @@
           <w:szCs w:val="22"/>
         </w:rPr>
       </w:pPr>
-      <w:bookmarkStart w:id="24" w:name="_Toc239680014"/>
+      <w:bookmarkStart w:id="24" w:name="_Toc239855427"/>
       <w:r>
         <w:rPr>
           <w:rFonts w:ascii="Bierstadt Display" w:eastAsia="Calibri" w:hAnsi="Bierstadt Display"/>
@@ -16125,7 +16144,7 @@
           <w:szCs w:val="26"/>
         </w:rPr>
       </w:pPr>
-      <w:bookmarkStart w:id="25" w:name="_Toc239680015"/>
+      <w:bookmarkStart w:id="25" w:name="_Toc239855428"/>
       <w:r>
         <w:rPr>
           <w:rFonts w:ascii="Bierstadt Display" w:eastAsia="Calibri" w:hAnsi="Bierstadt Display"/>
@@ -16313,7 +16332,7 @@
           <w:szCs w:val="26"/>
         </w:rPr>
       </w:pPr>
-      <w:bookmarkStart w:id="26" w:name="_Toc239680016"/>
+      <w:bookmarkStart w:id="26" w:name="_Toc239855429"/>
       <w:r>
         <w:rPr>
           <w:rFonts w:ascii="Bierstadt Display" w:eastAsia="Calibri" w:hAnsi="Bierstadt Display"/>
@@ -16748,7 +16767,7 @@
           <w:szCs w:val="26"/>
         </w:rPr>
       </w:pPr>
-      <w:bookmarkStart w:id="27" w:name="_Toc239680017"/>
+      <w:bookmarkStart w:id="27" w:name="_Toc239855430"/>
       <w:r>
         <w:rPr>
           <w:rFonts w:ascii="Bierstadt Display" w:eastAsia="Calibri" w:hAnsi="Bierstadt Display"/>
@@ -16792,7 +16811,7 @@
           <w:szCs w:val="22"/>
         </w:rPr>
       </w:pPr>
-      <w:bookmarkStart w:id="28" w:name="_Toc239680018"/>
+      <w:bookmarkStart w:id="28" w:name="_Toc239855431"/>
       <w:r>
         <w:rPr>
           <w:rFonts w:ascii="Bierstadt Display" w:hAnsi="Bierstadt Display"/>
@@ -16829,7 +16848,7 @@
           <w:szCs w:val="22"/>
         </w:rPr>
       </w:pPr>
-      <w:bookmarkStart w:id="29" w:name="_Toc239680019"/>
+      <w:bookmarkStart w:id="29" w:name="_Toc239855432"/>
       <w:r>
         <w:rPr>
           <w:rFonts w:ascii="Bierstadt Display" w:hAnsi="Bierstadt Display"/>
@@ -17657,7 +17676,7 @@
           <w:szCs w:val="22"/>
         </w:rPr>
       </w:pPr>
-      <w:bookmarkStart w:id="30" w:name="_Toc239680020"/>
+      <w:bookmarkStart w:id="30" w:name="_Toc239855433"/>
       <w:r>
         <w:rPr>
           <w:rFonts w:ascii="Bierstadt Display" w:hAnsi="Bierstadt Display"/>
@@ -18207,7 +18226,7 @@
           <w:szCs w:val="22"/>
         </w:rPr>
       </w:pPr>
-      <w:bookmarkStart w:id="31" w:name="_Toc239680021"/>
+      <w:bookmarkStart w:id="31" w:name="_Toc239855434"/>
       <w:r>
         <w:rPr>
           <w:rFonts w:ascii="Bierstadt Display" w:hAnsi="Bierstadt Display"/>
@@ -19657,7 +19676,7 @@
           <w:szCs w:val="26"/>
         </w:rPr>
       </w:pPr>
-      <w:bookmarkStart w:id="32" w:name="_Toc239680022"/>
+      <w:bookmarkStart w:id="32" w:name="_Toc239855435"/>
       <w:r>
         <w:rPr>
           <w:rFonts w:ascii="Bierstadt Display" w:eastAsia="Calibri" w:hAnsi="Bierstadt Display"/>
@@ -19941,7 +19960,7 @@
           <w:szCs w:val="26"/>
         </w:rPr>
       </w:pPr>
-      <w:bookmarkStart w:id="33" w:name="_Toc239680023"/>
+      <w:bookmarkStart w:id="33" w:name="_Toc239855436"/>
       <w:r>
         <w:rPr>
           <w:rFonts w:ascii="Bierstadt Display" w:eastAsia="Calibri" w:hAnsi="Bierstadt Display"/>
@@ -20096,7 +20115,7 @@
           <w:szCs w:val="22"/>
         </w:rPr>
       </w:pPr>
-      <w:bookmarkStart w:id="34" w:name="_Toc239680024"/>
+      <w:bookmarkStart w:id="34" w:name="_Toc239855437"/>
       <w:r>
         <w:rPr>
           <w:rFonts w:ascii="Bierstadt Display" w:hAnsi="Bierstadt Display"/>
@@ -20716,7 +20735,7 @@
           <w:szCs w:val="22"/>
         </w:rPr>
       </w:pPr>
-      <w:bookmarkStart w:id="35" w:name="_Toc239680025"/>
+      <w:bookmarkStart w:id="35" w:name="_Toc239855438"/>
       <w:r>
         <w:rPr>
           <w:rFonts w:ascii="Bierstadt Display" w:hAnsi="Bierstadt Display"/>
@@ -21766,7 +21785,7 @@
           <w:szCs w:val="22"/>
         </w:rPr>
       </w:pPr>
-      <w:bookmarkStart w:id="36" w:name="_Toc239680026"/>
+      <w:bookmarkStart w:id="36" w:name="_Toc239855439"/>
       <w:r>
         <w:rPr>
           <w:rFonts w:ascii="Bierstadt Display" w:hAnsi="Bierstadt Display"/>
@@ -22880,7 +22899,7 @@
           <w:szCs w:val="22"/>
         </w:rPr>
       </w:pPr>
-      <w:bookmarkStart w:id="37" w:name="_Toc239680027"/>
+      <w:bookmarkStart w:id="37" w:name="_Toc239855440"/>
       <w:r>
         <w:rPr>
           <w:rFonts w:ascii="Bierstadt Display" w:hAnsi="Bierstadt Display"/>
@@ -23780,7 +23799,7 @@
           <w:szCs w:val="22"/>
         </w:rPr>
       </w:pPr>
-      <w:bookmarkStart w:id="38" w:name="_Toc239680028"/>
+      <w:bookmarkStart w:id="38" w:name="_Toc239855441"/>
       <w:r>
         <w:rPr>
           <w:rFonts w:ascii="Bierstadt Display" w:hAnsi="Bierstadt Display"/>
@@ -24597,7 +24616,7 @@
           <w:szCs w:val="22"/>
         </w:rPr>
       </w:pPr>
-      <w:bookmarkStart w:id="39" w:name="_Toc239680029"/>
+      <w:bookmarkStart w:id="39" w:name="_Toc239855442"/>
       <w:r>
         <w:rPr>
           <w:rFonts w:ascii="Bierstadt Display" w:hAnsi="Bierstadt Display"/>
@@ -25683,7 +25702,7 @@
           <w:szCs w:val="26"/>
         </w:rPr>
       </w:pPr>
-      <w:bookmarkStart w:id="40" w:name="_Toc239680030"/>
+      <w:bookmarkStart w:id="40" w:name="_Toc239855443"/>
       <w:r>
         <w:rPr>
           <w:rFonts w:ascii="Bierstadt Display" w:eastAsia="Calibri" w:hAnsi="Bierstadt Display"/>
@@ -25724,7 +25743,7 @@
           <w:szCs w:val="22"/>
         </w:rPr>
       </w:pPr>
-      <w:bookmarkStart w:id="41" w:name="_Toc239680031"/>
+      <w:bookmarkStart w:id="41" w:name="_Toc239855444"/>
       <w:r>
         <w:rPr>
           <w:rFonts w:ascii="Bierstadt Display" w:hAnsi="Bierstadt Display"/>
@@ -27107,7 +27126,7 @@
           <w:szCs w:val="22"/>
         </w:rPr>
       </w:pPr>
-      <w:bookmarkStart w:id="42" w:name="_Toc239680032"/>
+      <w:bookmarkStart w:id="42" w:name="_Toc239855445"/>
       <w:r>
         <w:rPr>
           <w:rFonts w:ascii="Bierstadt Display" w:hAnsi="Bierstadt Display"/>
@@ -28248,7 +28267,7 @@
           <w:szCs w:val="22"/>
         </w:rPr>
       </w:pPr>
-      <w:bookmarkStart w:id="43" w:name="_Toc239680033"/>
+      <w:bookmarkStart w:id="43" w:name="_Toc239855446"/>
       <w:r>
         <w:rPr>
           <w:rFonts w:ascii="Bierstadt Display" w:hAnsi="Bierstadt Display"/>
@@ -29716,7 +29735,7 @@
           <w:szCs w:val="22"/>
         </w:rPr>
       </w:pPr>
-      <w:bookmarkStart w:id="44" w:name="_Toc239680034"/>
+      <w:bookmarkStart w:id="44" w:name="_Toc239855447"/>
       <w:r>
         <w:rPr>
           <w:rFonts w:ascii="Bierstadt Display" w:hAnsi="Bierstadt Display"/>
@@ -30677,7 +30696,7 @@
           <w:szCs w:val="22"/>
         </w:rPr>
       </w:pPr>
-      <w:bookmarkStart w:id="45" w:name="_Toc239680035"/>
+      <w:bookmarkStart w:id="45" w:name="_Toc239855448"/>
       <w:r>
         <w:rPr>
           <w:rFonts w:ascii="Bierstadt Display" w:hAnsi="Bierstadt Display"/>
@@ -30896,7 +30915,7 @@
           <w:szCs w:val="22"/>
         </w:rPr>
       </w:pPr>
-      <w:bookmarkStart w:id="46" w:name="_Toc239680036"/>
+      <w:bookmarkStart w:id="46" w:name="_Toc239855449"/>
       <w:r>
         <w:rPr>
           <w:rFonts w:ascii="Bierstadt Display" w:hAnsi="Bierstadt Display"/>
@@ -31526,7 +31545,7 @@
           <w:szCs w:val="22"/>
         </w:rPr>
       </w:pPr>
-      <w:bookmarkStart w:id="47" w:name="_Toc239680037"/>
+      <w:bookmarkStart w:id="47" w:name="_Toc239855450"/>
       <w:r>
         <w:rPr>
           <w:rFonts w:ascii="Bierstadt Display" w:hAnsi="Bierstadt Display"/>
@@ -31674,7 +31693,7 @@
           <w:szCs w:val="22"/>
         </w:rPr>
       </w:pPr>
-      <w:bookmarkStart w:id="48" w:name="_Toc239680038"/>
+      <w:bookmarkStart w:id="48" w:name="_Toc239855451"/>
       <w:r>
         <w:rPr>
           <w:rFonts w:ascii="Bierstadt Display" w:hAnsi="Bierstadt Display"/>
@@ -32075,7 +32094,7 @@
           <w:szCs w:val="26"/>
         </w:rPr>
       </w:pPr>
-      <w:bookmarkStart w:id="49" w:name="_Toc239680039"/>
+      <w:bookmarkStart w:id="49" w:name="_Toc239855452"/>
       <w:r>
         <w:rPr>
           <w:rFonts w:ascii="Bierstadt Display" w:eastAsia="Calibri" w:hAnsi="Bierstadt Display"/>
@@ -32098,7 +32117,7 @@
           <w:szCs w:val="22"/>
         </w:rPr>
       </w:pPr>
-      <w:bookmarkStart w:id="50" w:name="_Toc239680040"/>
+      <w:bookmarkStart w:id="50" w:name="_Toc239855453"/>
       <w:r>
         <w:rPr>
           <w:rFonts w:ascii="Bierstadt Display" w:eastAsia="Calibri" w:hAnsi="Bierstadt Display"/>
@@ -32307,7 +32326,7 @@
           <w:szCs w:val="22"/>
         </w:rPr>
       </w:pPr>
-      <w:bookmarkStart w:id="51" w:name="_Toc239680041"/>
+      <w:bookmarkStart w:id="51" w:name="_Toc239855454"/>
       <w:r>
         <w:rPr>
           <w:rFonts w:ascii="Bierstadt Display" w:eastAsia="Calibri" w:hAnsi="Bierstadt Display"/>
@@ -32558,7 +32577,7 @@
           <w:szCs w:val="26"/>
         </w:rPr>
       </w:pPr>
-      <w:bookmarkStart w:id="52" w:name="_Toc239680042"/>
+      <w:bookmarkStart w:id="52" w:name="_Toc239855455"/>
       <w:r>
         <w:rPr>
           <w:rFonts w:ascii="Bierstadt Display" w:eastAsia="Calibri" w:hAnsi="Bierstadt Display"/>
@@ -33450,7 +33469,7 @@
           <w:szCs w:val="26"/>
         </w:rPr>
       </w:pPr>
-      <w:bookmarkStart w:id="53" w:name="_Toc239680043"/>
+      <w:bookmarkStart w:id="53" w:name="_Toc239855456"/>
       <w:r>
         <w:rPr>
           <w:rFonts w:ascii="Bierstadt Display" w:eastAsia="Calibri" w:hAnsi="Bierstadt Display"/>
@@ -33472,7 +33491,7 @@
           <w:szCs w:val="22"/>
         </w:rPr>
       </w:pPr>
-      <w:bookmarkStart w:id="54" w:name="_Toc239680044"/>
+      <w:bookmarkStart w:id="54" w:name="_Toc239855457"/>
       <w:r>
         <w:rPr>
           <w:rFonts w:ascii="Bierstadt Display" w:hAnsi="Bierstadt Display"/>
@@ -34216,7 +34235,7 @@
           <w:szCs w:val="22"/>
         </w:rPr>
       </w:pPr>
-      <w:bookmarkStart w:id="55" w:name="_Toc239680045"/>
+      <w:bookmarkStart w:id="55" w:name="_Toc239855458"/>
       <w:r>
         <w:rPr>
           <w:rFonts w:ascii="Bierstadt Display" w:eastAsia="Calibri" w:hAnsi="Bierstadt Display"/>
@@ -34490,7 +34509,7 @@
           <w:szCs w:val="22"/>
         </w:rPr>
       </w:pPr>
-      <w:bookmarkStart w:id="56" w:name="_Toc239680046"/>
+      <w:bookmarkStart w:id="56" w:name="_Toc239855459"/>
       <w:r>
         <w:rPr>
           <w:rFonts w:ascii="Bierstadt Display" w:eastAsia="Calibri" w:hAnsi="Bierstadt Display"/>
@@ -36026,7 +36045,7 @@
           <w:szCs w:val="22"/>
         </w:rPr>
       </w:pPr>
-      <w:bookmarkStart w:id="57" w:name="_Toc239680047"/>
+      <w:bookmarkStart w:id="57" w:name="_Toc239855460"/>
       <w:r>
         <w:rPr>
           <w:rFonts w:ascii="Bierstadt Display" w:eastAsia="Calibri" w:hAnsi="Bierstadt Display"/>
@@ -36080,7 +36099,7 @@
           <w:szCs w:val="22"/>
         </w:rPr>
       </w:pPr>
-      <w:bookmarkStart w:id="58" w:name="_Toc239680048"/>
+      <w:bookmarkStart w:id="58" w:name="_Toc239855461"/>
       <w:r>
         <w:rPr>
           <w:rFonts w:ascii="Bierstadt Display" w:eastAsia="Calibri" w:hAnsi="Bierstadt Display"/>
@@ -36164,7 +36183,7 @@
           <w:szCs w:val="22"/>
         </w:rPr>
       </w:pPr>
-      <w:bookmarkStart w:id="59" w:name="_Toc239680049"/>
+      <w:bookmarkStart w:id="59" w:name="_Toc239855462"/>
       <w:r>
         <w:rPr>
           <w:rFonts w:ascii="Bierstadt Display" w:eastAsia="Calibri" w:hAnsi="Bierstadt Display"/>
@@ -36214,7 +36233,7 @@
           <w:szCs w:val="22"/>
         </w:rPr>
       </w:pPr>
-      <w:bookmarkStart w:id="60" w:name="_Toc239680050"/>
+      <w:bookmarkStart w:id="60" w:name="_Toc239855463"/>
       <w:r>
         <w:rPr>
           <w:rFonts w:ascii="Bierstadt Display" w:eastAsia="Calibri" w:hAnsi="Bierstadt Display"/>
@@ -36349,7 +36368,7 @@
           <w:szCs w:val="22"/>
         </w:rPr>
       </w:pPr>
-      <w:bookmarkStart w:id="61" w:name="_Toc239680051"/>
+      <w:bookmarkStart w:id="61" w:name="_Toc239855464"/>
       <w:r>
         <w:rPr>
           <w:rFonts w:ascii="Bierstadt Display" w:eastAsia="Calibri" w:hAnsi="Bierstadt Display"/>
@@ -37553,7 +37572,7 @@
           <w:szCs w:val="22"/>
         </w:rPr>
       </w:pPr>
-      <w:bookmarkStart w:id="62" w:name="_Toc239680052"/>
+      <w:bookmarkStart w:id="62" w:name="_Toc239855465"/>
       <w:r>
         <w:rPr>
           <w:rFonts w:ascii="Bierstadt Display" w:eastAsia="Calibri" w:hAnsi="Bierstadt Display"/>

</xml_diff>